<commit_message>
Loan and savings reversal entries display
</commit_message>
<xml_diff>
--- a/Layout/Finance Share Certificate.docx
+++ b/Layout/Finance Share Certificate.docx
@@ -1,6 +1,6 @@
 
 <file path=word/document.xml><?xml version="1.0" encoding="utf-8"?>
-<w:document xmlns:a="http://schemas.openxmlformats.org/drawingml/2006/main" xmlns:pic="http://schemas.openxmlformats.org/drawingml/2006/picture" xmlns:a14="http://schemas.microsoft.com/office/drawing/2010/main" xmlns:wpc="http://schemas.microsoft.com/office/word/2010/wordprocessingCanvas" xmlns:cx="http://schemas.microsoft.com/office/drawing/2014/chartex" xmlns:cx1="http://schemas.microsoft.com/office/drawing/2015/9/8/chartex" xmlns:cx2="http://schemas.microsoft.com/office/drawing/2015/10/21/chartex" xmlns:cx3="http://schemas.microsoft.com/office/drawing/2016/5/9/chartex" xmlns:cx4="http://schemas.microsoft.com/office/drawing/2016/5/10/chartex" xmlns:cx5="http://schemas.microsoft.com/office/drawing/2016/5/11/chartex" xmlns:cx6="http://schemas.microsoft.com/office/drawing/2016/5/12/chartex" xmlns:cx7="http://schemas.microsoft.com/office/drawing/2016/5/13/chartex" xmlns:cx8="http://schemas.microsoft.com/office/drawing/2016/5/14/chartex" xmlns:mc="http://schemas.openxmlformats.org/markup-compatibility/2006" xmlns:aink="http://schemas.microsoft.com/office/drawing/2016/ink" xmlns:am3d="http://schemas.microsoft.com/office/drawing/2017/model3d" xmlns:o="urn:schemas-microsoft-com:office:office" xmlns:r="http://schemas.openxmlformats.org/officeDocument/2006/relationships" xmlns:m="http://schemas.openxmlformats.org/officeDocument/2006/math" xmlns:v="urn:schemas-microsoft-com:vml" xmlns:wp14="http://schemas.microsoft.com/office/word/2010/wordprocessingDrawing" xmlns:wp="http://schemas.openxmlformats.org/drawingml/2006/wordprocessingDrawing" xmlns:w10="urn:schemas-microsoft-com:office:word" xmlns:w="http://schemas.openxmlformats.org/wordprocessingml/2006/main" xmlns:w14="http://schemas.microsoft.com/office/word/2010/wordml" xmlns:w15="http://schemas.microsoft.com/office/word/2012/wordml" xmlns:w16cex="http://schemas.microsoft.com/office/word/2018/wordml/cex" xmlns:w16cid="http://schemas.microsoft.com/office/word/2016/wordml/cid" xmlns:w16="http://schemas.microsoft.com/office/word/2018/wordml" xmlns:w16se="http://schemas.microsoft.com/office/word/2015/wordml/symex" xmlns:wpg="http://schemas.microsoft.com/office/word/2010/wordprocessingGroup" xmlns:wpi="http://schemas.microsoft.com/office/word/2010/wordprocessingInk" xmlns:wne="http://schemas.microsoft.com/office/word/2006/wordml" xmlns:wps="http://schemas.microsoft.com/office/word/2010/wordprocessingShape" mc:Ignorable="w14 w15 w16se w16cid w16 w16cex wp14">
+<w:document xmlns:a="http://schemas.openxmlformats.org/drawingml/2006/main" xmlns:pic="http://schemas.openxmlformats.org/drawingml/2006/picture" xmlns:a14="http://schemas.microsoft.com/office/drawing/2010/main" xmlns:wpc="http://schemas.microsoft.com/office/word/2010/wordprocessingCanvas" xmlns:cx="http://schemas.microsoft.com/office/drawing/2014/chartex" xmlns:cx1="http://schemas.microsoft.com/office/drawing/2015/9/8/chartex" xmlns:cx2="http://schemas.microsoft.com/office/drawing/2015/10/21/chartex" xmlns:cx3="http://schemas.microsoft.com/office/drawing/2016/5/9/chartex" xmlns:cx4="http://schemas.microsoft.com/office/drawing/2016/5/10/chartex" xmlns:cx5="http://schemas.microsoft.com/office/drawing/2016/5/11/chartex" xmlns:cx6="http://schemas.microsoft.com/office/drawing/2016/5/12/chartex" xmlns:cx7="http://schemas.microsoft.com/office/drawing/2016/5/13/chartex" xmlns:cx8="http://schemas.microsoft.com/office/drawing/2016/5/14/chartex" xmlns:mc="http://schemas.openxmlformats.org/markup-compatibility/2006" xmlns:aink="http://schemas.microsoft.com/office/drawing/2016/ink" xmlns:am3d="http://schemas.microsoft.com/office/drawing/2017/model3d" xmlns:o="urn:schemas-microsoft-com:office:office" xmlns:oel="http://schemas.microsoft.com/office/2019/extlst" xmlns:r="http://schemas.openxmlformats.org/officeDocument/2006/relationships" xmlns:m="http://schemas.openxmlformats.org/officeDocument/2006/math" xmlns:v="urn:schemas-microsoft-com:vml" xmlns:wp14="http://schemas.microsoft.com/office/word/2010/wordprocessingDrawing" xmlns:wp="http://schemas.openxmlformats.org/drawingml/2006/wordprocessingDrawing" xmlns:w10="urn:schemas-microsoft-com:office:word" xmlns:w="http://schemas.openxmlformats.org/wordprocessingml/2006/main" xmlns:w14="http://schemas.microsoft.com/office/word/2010/wordml" xmlns:w15="http://schemas.microsoft.com/office/word/2012/wordml" xmlns:w16cex="http://schemas.microsoft.com/office/word/2018/wordml/cex" xmlns:w16cid="http://schemas.microsoft.com/office/word/2016/wordml/cid" xmlns:w16="http://schemas.microsoft.com/office/word/2018/wordml" xmlns:w16du="http://schemas.microsoft.com/office/word/2023/wordml/word16du" xmlns:w16sdtdh="http://schemas.microsoft.com/office/word/2020/wordml/sdtdatahash" xmlns:w16sdtfl="http://schemas.microsoft.com/office/word/2024/wordml/sdtformatlock" xmlns:w16se="http://schemas.microsoft.com/office/word/2015/wordml/symex" xmlns:wpg="http://schemas.microsoft.com/office/word/2010/wordprocessingGroup" xmlns:wpi="http://schemas.microsoft.com/office/word/2010/wordprocessingInk" xmlns:wne="http://schemas.microsoft.com/office/word/2006/wordml" xmlns:wps="http://schemas.microsoft.com/office/word/2010/wordprocessingShape" mc:Ignorable="w14 w15 w16se w16cid w16 w16cex w16sdtdh w16sdtfl w16du wp14">
   <w:body>
     <w:p>
       <w:pPr>
@@ -195,7 +195,7 @@
                 <v:stroke joinstyle="miter"/>
                 <v:path gradientshapeok="t" o:connecttype="rect"/>
               </v:shapetype>
-              <v:shape id="Text Box 2" style="position:absolute;left:0;text-align:left;margin-left:807.7pt;margin-top:39.15pt;width:858.9pt;height:34.2pt;flip:y;z-index:251659264;visibility:visible;mso-wrap-style:square;mso-width-percent:0;mso-height-percent:0;mso-wrap-distance-left:9pt;mso-wrap-distance-top:3.6pt;mso-wrap-distance-right:9pt;mso-wrap-distance-bottom:3.6pt;mso-position-horizontal:right;mso-position-horizontal-relative:margin;mso-position-vertical:absolute;mso-position-vertical-relative:text;mso-width-percent:0;mso-height-percent:0;mso-width-relative:margin;mso-height-relative:margin;v-text-anchor:top" o:spid="_x0000_s1026" filled="f" stroked="f" type="#_x0000_t202" o:gfxdata="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">
+              <v:shape id="Text Box 2" style="position:absolute;left:0;text-align:left;margin-left:807.7pt;margin-top:39.15pt;width:858.9pt;height:34.2pt;flip:y;z-index:251659264;visibility:visible;mso-wrap-style:square;mso-width-percent:0;mso-height-percent:0;mso-wrap-distance-left:9pt;mso-wrap-distance-top:3.6pt;mso-wrap-distance-right:9pt;mso-wrap-distance-bottom:3.6pt;mso-position-horizontal:right;mso-position-horizontal-relative:margin;mso-position-vertical:absolute;mso-position-vertical-relative:text;mso-width-percent:0;mso-height-percent:0;mso-width-relative:margin;mso-height-relative:margin;v-text-anchor:top" o:spid="_x0000_s1026" filled="f" stroked="f" type="#_x0000_t202" o:gfxdata="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">
                 <v:textbox>
                   <w:txbxContent>
                     <w:p>
@@ -254,7 +254,6 @@
           <w:dataBinding w:prefixMappings="xmlns:ns0='urn:microsoft-dynamics-nav/reports/Finance_Share_Certificate/52186157/'" w:xpath="/ns0:NavWordReportXmlPart[1]/ns0:Members[1]/ns0:Name[1]" w:storeItemID="{31E59954-CB1B-4E80-8940-F143CD0AE04B}"/>
           <w:text/>
         </w:sdtPr>
-        <w:sdtEndPr/>
         <w:sdtContent>
           <w:r>
             <w:rPr>
@@ -359,7 +358,6 @@
                               <w:dataBinding w:prefixMappings="xmlns:ns0='urn:microsoft-dynamics-nav/reports/Finance_Share_Certificate/52186157/'" w:xpath="/ns0:NavWordReportXmlPart[1]/ns0:Members[1]/ns0:CEO_Signature[1]" w:storeItemID="{31E59954-CB1B-4E80-8940-F143CD0AE04B}"/>
                               <w:picture/>
                             </w:sdtPr>
-                            <w:sdtEndPr/>
                             <w:sdtContent>
                               <w:p>
                                 <w:pPr>
@@ -442,7 +440,7 @@
               </wp:anchor>
             </w:drawing>
           </mc:Choice>
-          <mc:Fallback>
+          <mc:Fallback xmlns:a14="http://schemas.microsoft.com/office/drawing/2010/main" xmlns:pic="http://schemas.openxmlformats.org/drawingml/2006/picture" xmlns:a="http://schemas.openxmlformats.org/drawingml/2006/main">
             <w:pict>
               <v:shape id="Text Box 3" style="position:absolute;margin-left:528.8pt;margin-top:47.95pt;width:235.2pt;height:96.95pt;z-index:251661312;visibility:visible;mso-wrap-style:square;mso-width-percent:0;mso-height-percent:0;mso-wrap-distance-left:9pt;mso-wrap-distance-top:3.6pt;mso-wrap-distance-right:9pt;mso-wrap-distance-bottom:3.6pt;mso-position-horizontal:absolute;mso-position-horizontal-relative:margin;mso-position-vertical:absolute;mso-position-vertical-relative:text;mso-width-percent:0;mso-height-percent:0;mso-width-relative:margin;mso-height-relative:margin;v-text-anchor:top" o:spid="_x0000_s1027" filled="f" stroked="f" type="#_x0000_t202" o:gfxdata="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" w14:anchorId="357497AF">
                 <v:textbox>
@@ -498,7 +496,7 @@
                                         </pic:cNvPicPr>
                                       </pic:nvPicPr>
                                       <pic:blipFill>
-                                        <a:blip r:embed="rId7">
+                                        <a:blip r:embed="rId8">
                                           <a:extLst>
                                             <a:ext uri="{28A0092B-C50C-407E-A947-70E740481C1C}">
                                               <a14:useLocalDpi xmlns:a14="http://schemas.microsoft.com/office/drawing/2010/main" val="0"/>
@@ -609,7 +607,6 @@
                               <w:dataBinding w:prefixMappings="xmlns:ns0='urn:microsoft-dynamics-nav/reports/Finance_Share_Certificate/52186157/'" w:xpath="/ns0:NavWordReportXmlPart[1]/ns0:Members[1]/ns0:Director_Signature[1]" w:storeItemID="{31E59954-CB1B-4E80-8940-F143CD0AE04B}"/>
                               <w:picture/>
                             </w:sdtPr>
-                            <w:sdtEndPr/>
                             <w:sdtContent>
                               <w:p>
                                 <w:pPr>
@@ -641,7 +638,7 @@
                                               </pic:cNvPicPr>
                                             </pic:nvPicPr>
                                             <pic:blipFill>
-                                              <a:blip r:embed="rId7">
+                                              <a:blip r:embed="rId8">
                                                 <a:extLst>
                                                   <a:ext uri="{28A0092B-C50C-407E-A947-70E740481C1C}">
                                                     <a14:useLocalDpi xmlns:a14="http://schemas.microsoft.com/office/drawing/2010/main" val="0"/>
@@ -699,7 +696,7 @@
               </wp:anchor>
             </w:drawing>
           </mc:Choice>
-          <mc:Fallback>
+          <mc:Fallback xmlns:a14="http://schemas.microsoft.com/office/drawing/2010/main" xmlns:pic="http://schemas.openxmlformats.org/drawingml/2006/picture" xmlns:a="http://schemas.openxmlformats.org/drawingml/2006/main">
             <w:pict>
               <v:shape id="_x0000_s1028" style="position:absolute;margin-left:86.85pt;margin-top:54.35pt;width:185.3pt;height:113.85pt;z-index:251660288;visibility:visible;mso-wrap-style:square;mso-width-percent:0;mso-height-percent:0;mso-wrap-distance-left:9pt;mso-wrap-distance-top:3.6pt;mso-wrap-distance-right:9pt;mso-wrap-distance-bottom:3.6pt;mso-position-horizontal:absolute;mso-position-horizontal-relative:margin;mso-position-vertical:absolute;mso-position-vertical-relative:text;mso-width-percent:0;mso-height-percent:0;mso-width-relative:margin;mso-height-relative:margin;v-text-anchor:top" filled="f" stroked="f" type="#_x0000_t202" o:gfxdata="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" w14:anchorId="7696F32C">
                 <v:textbox>
@@ -755,7 +752,7 @@
                                         </pic:cNvPicPr>
                                       </pic:nvPicPr>
                                       <pic:blipFill>
-                                        <a:blip r:embed="rId7">
+                                        <a:blip r:embed="rId8">
                                           <a:extLst>
                                             <a:ext uri="{28A0092B-C50C-407E-A947-70E740481C1C}">
                                               <a14:useLocalDpi xmlns:a14="http://schemas.microsoft.com/office/drawing/2010/main" val="0"/>
@@ -871,7 +868,6 @@
                               <w:dataBinding w:prefixMappings="xmlns:ns0='urn:microsoft-dynamics-nav/reports/Finance_Share_Certificate/52186157/'" w:xpath="/ns0:NavWordReportXmlPart[1]/ns0:Members[1]/ns0:CEOName[1]" w:storeItemID="{31E59954-CB1B-4E80-8940-F143CD0AE04B}"/>
                               <w:text/>
                             </w:sdtPr>
-                            <w:sdtEndPr/>
                             <w:sdtContent>
                               <w:p>
                                 <w:pPr>
@@ -936,7 +932,7 @@
               </wp:anchor>
             </w:drawing>
           </mc:Choice>
-          <mc:Fallback>
+          <mc:Fallback xmlns:a14="http://schemas.microsoft.com/office/drawing/2010/main" xmlns:pic="http://schemas.openxmlformats.org/drawingml/2006/picture" xmlns:a="http://schemas.openxmlformats.org/drawingml/2006/main">
             <w:pict>
               <v:shape id="_x0000_s1029" style="position:absolute;margin-left:510.25pt;margin-top:193.1pt;width:270.85pt;height:57.7pt;z-index:251662336;visibility:visible;mso-wrap-style:square;mso-width-percent:0;mso-height-percent:0;mso-wrap-distance-left:9pt;mso-wrap-distance-top:3.6pt;mso-wrap-distance-right:9pt;mso-wrap-distance-bottom:3.6pt;mso-position-horizontal:absolute;mso-position-horizontal-relative:margin;mso-position-vertical:absolute;mso-position-vertical-relative:text;mso-width-percent:0;mso-height-percent:0;mso-width-relative:margin;mso-height-relative:margin;v-text-anchor:top" filled="f" stroked="f" type="#_x0000_t202" o:gfxdata="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" w14:anchorId="34EA6365">
                 <v:textbox>
@@ -1049,7 +1045,6 @@
           <w:dataBinding w:prefixMappings="xmlns:ns0='urn:microsoft-dynamics-nav/reports/Finance_Share_Certificate/52186157/'" w:xpath="/ns0:NavWordReportXmlPart[1]/ns0:Members[1]/ns0:No[1]" w:storeItemID="{31E59954-CB1B-4E80-8940-F143CD0AE04B}"/>
           <w:text/>
         </w:sdtPr>
-        <w:sdtEndPr/>
         <w:sdtContent>
           <w:r>
             <w:rPr>
@@ -1107,7 +1102,6 @@
           <w:dataBinding w:prefixMappings="xmlns:ns0='urn:microsoft-dynamics-nav/reports/Finance_Share_Certificate/52186157/'" w:xpath="/ns0:NavWordReportXmlPart[1]/ns0:Members[1]/ns0:PrimaryIdentification[1]" w:storeItemID="{31E59954-CB1B-4E80-8940-F143CD0AE04B}"/>
           <w:text/>
         </w:sdtPr>
-        <w:sdtEndPr/>
         <w:sdtContent>
           <w:proofErr w:type="spellStart"/>
           <w:r>
@@ -1167,7 +1161,6 @@
           <w:dataBinding w:prefixMappings="xmlns:ns0='urn:microsoft-dynamics-nav/reports/Finance_Share_Certificate/52186157/'" w:xpath="/ns0:NavWordReportXmlPart[1]/ns0:Members[1]/ns0:NoofShares[1]" w:storeItemID="{31E59954-CB1B-4E80-8940-F143CD0AE04B}"/>
           <w:text/>
         </w:sdtPr>
-        <w:sdtEndPr/>
         <w:sdtContent>
           <w:proofErr w:type="spellStart"/>
           <w:r>
@@ -1239,7 +1232,6 @@
           <w:dataBinding w:prefixMappings="xmlns:ns0='urn:microsoft-dynamics-nav/reports/Finance_Share_Certificate/52186157/'" w:xpath="/ns0:NavWordReportXmlPart[1]/ns0:Members[1]/ns0:SharePrice[1]" w:storeItemID="{31E59954-CB1B-4E80-8940-F143CD0AE04B}"/>
           <w:text/>
         </w:sdtPr>
-        <w:sdtEndPr/>
         <w:sdtContent>
           <w:proofErr w:type="spellStart"/>
           <w:r>
@@ -1320,7 +1312,6 @@
           <w:dataBinding w:prefixMappings="xmlns:ns0='urn:microsoft-dynamics-nav/reports/Finance_Share_Certificate/52186157/'" w:xpath="/ns0:NavWordReportXmlPart[1]/ns0:Members[1]/ns0:ShareCapBalance[1]" w:storeItemID="{31E59954-CB1B-4E80-8940-F143CD0AE04B}"/>
           <w:text/>
         </w:sdtPr>
-        <w:sdtEndPr/>
         <w:sdtContent>
           <w:proofErr w:type="spellStart"/>
           <w:r>
@@ -1360,7 +1351,7 @@
           <w:szCs w:val="24"/>
           <w:lang w:val="en-US"/>
         </w:rPr>
-        <w:t>KENPIPE</w:t>
+        <w:t>AZIMA</w:t>
       </w:r>
       <w:r>
         <w:rPr>
@@ -1461,7 +1452,6 @@
           <w:dataBinding w:prefixMappings="xmlns:ns0='urn:microsoft-dynamics-nav/reports/Finance_Share_Certificate/52186157/'" w:xpath="/ns0:NavWordReportXmlPart[1]/ns0:Members[1]/ns0:PrintingDate[1]" w:storeItemID="{31E59954-CB1B-4E80-8940-F143CD0AE04B}"/>
           <w:text/>
         </w:sdtPr>
-        <w:sdtEndPr/>
         <w:sdtContent>
           <w:proofErr w:type="spellStart"/>
           <w:r>
@@ -1550,7 +1540,6 @@
                               <w:dataBinding w:prefixMappings="xmlns:ns0='urn:microsoft-dynamics-nav/reports/Finance_Share_Certificate/52186157/'" w:xpath="/ns0:NavWordReportXmlPart[1]/ns0:Members[1]/ns0:DirectorName[1]" w:storeItemID="{31E59954-CB1B-4E80-8940-F143CD0AE04B}"/>
                               <w:text/>
                             </w:sdtPr>
-                            <w:sdtEndPr/>
                             <w:sdtContent>
                               <w:p>
                                 <w:pPr>
@@ -1615,7 +1604,7 @@
               </wp:anchor>
             </w:drawing>
           </mc:Choice>
-          <mc:Fallback>
+          <mc:Fallback xmlns:a14="http://schemas.microsoft.com/office/drawing/2010/main" xmlns:pic="http://schemas.openxmlformats.org/drawingml/2006/picture" xmlns:a="http://schemas.openxmlformats.org/drawingml/2006/main">
             <w:pict>
               <v:shape id="_x0000_s1030" style="position:absolute;margin-left:76.15pt;margin-top:198.85pt;width:204.55pt;height:59.8pt;z-index:251664384;visibility:visible;mso-wrap-style:square;mso-width-percent:0;mso-height-percent:0;mso-wrap-distance-left:9pt;mso-wrap-distance-top:3.6pt;mso-wrap-distance-right:9pt;mso-wrap-distance-bottom:3.6pt;mso-position-horizontal:absolute;mso-position-horizontal-relative:margin;mso-position-vertical:absolute;mso-position-vertical-relative:text;mso-width-percent:0;mso-height-percent:0;mso-width-relative:margin;mso-height-relative:margin;v-text-anchor:top" filled="f" stroked="f" type="#_x0000_t202" o:gfxdata="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" w14:anchorId="5C74517A">
                 <v:textbox>
@@ -1693,10 +1682,8 @@
     </w:p>
     <w:p/>
     <w:sectPr>
-      <w:headerReference w:type="even" r:id="rId8"/>
       <w:headerReference w:type="default" r:id="rId9"/>
       <w:footerReference w:type="default" r:id="rId10"/>
-      <w:headerReference w:type="first" r:id="rId11"/>
       <w:pgSz w:w="20160" w:h="12240" w:orient="landscape" w:code="5"/>
       <w:pgMar w:top="1138" w:right="1699" w:bottom="1138" w:left="1699" w:header="144" w:footer="706" w:gutter="0"/>
       <w:pgBorders w:offsetFrom="page">
@@ -1713,7 +1700,7 @@
 </file>
 
 <file path=word/endnotes.xml><?xml version="1.0" encoding="utf-8"?>
-<w:endnotes xmlns:wpc="http://schemas.microsoft.com/office/word/2010/wordprocessingCanvas" xmlns:cx="http://schemas.microsoft.com/office/drawing/2014/chartex" xmlns:cx1="http://schemas.microsoft.com/office/drawing/2015/9/8/chartex" xmlns:cx2="http://schemas.microsoft.com/office/drawing/2015/10/21/chartex" xmlns:cx3="http://schemas.microsoft.com/office/drawing/2016/5/9/chartex" xmlns:cx4="http://schemas.microsoft.com/office/drawing/2016/5/10/chartex" xmlns:cx5="http://schemas.microsoft.com/office/drawing/2016/5/11/chartex" xmlns:cx6="http://schemas.microsoft.com/office/drawing/2016/5/12/chartex" xmlns:cx7="http://schemas.microsoft.com/office/drawing/2016/5/13/chartex" xmlns:cx8="http://schemas.microsoft.com/office/drawing/2016/5/14/chartex" xmlns:mc="http://schemas.openxmlformats.org/markup-compatibility/2006" xmlns:aink="http://schemas.microsoft.com/office/drawing/2016/ink" xmlns:am3d="http://schemas.microsoft.com/office/drawing/2017/model3d" xmlns:o="urn:schemas-microsoft-com:office:office" xmlns:r="http://schemas.openxmlformats.org/officeDocument/2006/relationships" xmlns:m="http://schemas.openxmlformats.org/officeDocument/2006/math" xmlns:v="urn:schemas-microsoft-com:vml" xmlns:wp14="http://schemas.microsoft.com/office/word/2010/wordprocessingDrawing" xmlns:wp="http://schemas.openxmlformats.org/drawingml/2006/wordprocessingDrawing" xmlns:w10="urn:schemas-microsoft-com:office:word" xmlns:w="http://schemas.openxmlformats.org/wordprocessingml/2006/main" xmlns:w14="http://schemas.microsoft.com/office/word/2010/wordml" xmlns:w15="http://schemas.microsoft.com/office/word/2012/wordml" xmlns:w16cex="http://schemas.microsoft.com/office/word/2018/wordml/cex" xmlns:w16cid="http://schemas.microsoft.com/office/word/2016/wordml/cid" xmlns:w16="http://schemas.microsoft.com/office/word/2018/wordml" xmlns:w16se="http://schemas.microsoft.com/office/word/2015/wordml/symex" xmlns:wpg="http://schemas.microsoft.com/office/word/2010/wordprocessingGroup" xmlns:wpi="http://schemas.microsoft.com/office/word/2010/wordprocessingInk" xmlns:wne="http://schemas.microsoft.com/office/word/2006/wordml" xmlns:wps="http://schemas.microsoft.com/office/word/2010/wordprocessingShape" mc:Ignorable="w14 w15 w16se w16cid w16 w16cex wp14">
+<w:endnotes xmlns:wpc="http://schemas.microsoft.com/office/word/2010/wordprocessingCanvas" xmlns:cx="http://schemas.microsoft.com/office/drawing/2014/chartex" xmlns:cx1="http://schemas.microsoft.com/office/drawing/2015/9/8/chartex" xmlns:cx2="http://schemas.microsoft.com/office/drawing/2015/10/21/chartex" xmlns:cx3="http://schemas.microsoft.com/office/drawing/2016/5/9/chartex" xmlns:cx4="http://schemas.microsoft.com/office/drawing/2016/5/10/chartex" xmlns:cx5="http://schemas.microsoft.com/office/drawing/2016/5/11/chartex" xmlns:cx6="http://schemas.microsoft.com/office/drawing/2016/5/12/chartex" xmlns:cx7="http://schemas.microsoft.com/office/drawing/2016/5/13/chartex" xmlns:cx8="http://schemas.microsoft.com/office/drawing/2016/5/14/chartex" xmlns:mc="http://schemas.openxmlformats.org/markup-compatibility/2006" xmlns:aink="http://schemas.microsoft.com/office/drawing/2016/ink" xmlns:am3d="http://schemas.microsoft.com/office/drawing/2017/model3d" xmlns:o="urn:schemas-microsoft-com:office:office" xmlns:oel="http://schemas.microsoft.com/office/2019/extlst" xmlns:r="http://schemas.openxmlformats.org/officeDocument/2006/relationships" xmlns:m="http://schemas.openxmlformats.org/officeDocument/2006/math" xmlns:v="urn:schemas-microsoft-com:vml" xmlns:wp14="http://schemas.microsoft.com/office/word/2010/wordprocessingDrawing" xmlns:wp="http://schemas.openxmlformats.org/drawingml/2006/wordprocessingDrawing" xmlns:w10="urn:schemas-microsoft-com:office:word" xmlns:w="http://schemas.openxmlformats.org/wordprocessingml/2006/main" xmlns:w14="http://schemas.microsoft.com/office/word/2010/wordml" xmlns:w15="http://schemas.microsoft.com/office/word/2012/wordml" xmlns:w16cex="http://schemas.microsoft.com/office/word/2018/wordml/cex" xmlns:w16cid="http://schemas.microsoft.com/office/word/2016/wordml/cid" xmlns:w16="http://schemas.microsoft.com/office/word/2018/wordml" xmlns:w16du="http://schemas.microsoft.com/office/word/2023/wordml/word16du" xmlns:w16sdtdh="http://schemas.microsoft.com/office/word/2020/wordml/sdtdatahash" xmlns:w16sdtfl="http://schemas.microsoft.com/office/word/2024/wordml/sdtformatlock" xmlns:w16se="http://schemas.microsoft.com/office/word/2015/wordml/symex" xmlns:wpg="http://schemas.microsoft.com/office/word/2010/wordprocessingGroup" xmlns:wpi="http://schemas.microsoft.com/office/word/2010/wordprocessingInk" xmlns:wne="http://schemas.microsoft.com/office/word/2006/wordml" xmlns:wps="http://schemas.microsoft.com/office/word/2010/wordprocessingShape" mc:Ignorable="w14 w15 w16se w16cid w16 w16cex w16sdtdh w16sdtfl w16du wp14">
   <w:endnote w:type="separator" w:id="-1">
     <w:p>
       <w:pPr>
@@ -1738,7 +1725,7 @@
 </file>
 
 <file path=word/footer1.xml><?xml version="1.0" encoding="utf-8"?>
-<w:ftr xmlns:wpc="http://schemas.microsoft.com/office/word/2010/wordprocessingCanvas" xmlns:cx="http://schemas.microsoft.com/office/drawing/2014/chartex" xmlns:cx1="http://schemas.microsoft.com/office/drawing/2015/9/8/chartex" xmlns:cx2="http://schemas.microsoft.com/office/drawing/2015/10/21/chartex" xmlns:cx3="http://schemas.microsoft.com/office/drawing/2016/5/9/chartex" xmlns:cx4="http://schemas.microsoft.com/office/drawing/2016/5/10/chartex" xmlns:cx5="http://schemas.microsoft.com/office/drawing/2016/5/11/chartex" xmlns:cx6="http://schemas.microsoft.com/office/drawing/2016/5/12/chartex" xmlns:cx7="http://schemas.microsoft.com/office/drawing/2016/5/13/chartex" xmlns:cx8="http://schemas.microsoft.com/office/drawing/2016/5/14/chartex" xmlns:mc="http://schemas.openxmlformats.org/markup-compatibility/2006" xmlns:aink="http://schemas.microsoft.com/office/drawing/2016/ink" xmlns:am3d="http://schemas.microsoft.com/office/drawing/2017/model3d" xmlns:o="urn:schemas-microsoft-com:office:office" xmlns:r="http://schemas.openxmlformats.org/officeDocument/2006/relationships" xmlns:m="http://schemas.openxmlformats.org/officeDocument/2006/math" xmlns:v="urn:schemas-microsoft-com:vml" xmlns:wp14="http://schemas.microsoft.com/office/word/2010/wordprocessingDrawing" xmlns:wp="http://schemas.openxmlformats.org/drawingml/2006/wordprocessingDrawing" xmlns:w10="urn:schemas-microsoft-com:office:word" xmlns:w="http://schemas.openxmlformats.org/wordprocessingml/2006/main" xmlns:w14="http://schemas.microsoft.com/office/word/2010/wordml" xmlns:w15="http://schemas.microsoft.com/office/word/2012/wordml" xmlns:w16cex="http://schemas.microsoft.com/office/word/2018/wordml/cex" xmlns:w16cid="http://schemas.microsoft.com/office/word/2016/wordml/cid" xmlns:w16="http://schemas.microsoft.com/office/word/2018/wordml" xmlns:w16se="http://schemas.microsoft.com/office/word/2015/wordml/symex" xmlns:wpg="http://schemas.microsoft.com/office/word/2010/wordprocessingGroup" xmlns:wpi="http://schemas.microsoft.com/office/word/2010/wordprocessingInk" xmlns:wne="http://schemas.microsoft.com/office/word/2006/wordml" xmlns:wps="http://schemas.microsoft.com/office/word/2010/wordprocessingShape" mc:Ignorable="w14 w15 w16se w16cid w16 w16cex wp14">
+<w:ftr xmlns:wpc="http://schemas.microsoft.com/office/word/2010/wordprocessingCanvas" xmlns:cx="http://schemas.microsoft.com/office/drawing/2014/chartex" xmlns:cx1="http://schemas.microsoft.com/office/drawing/2015/9/8/chartex" xmlns:cx2="http://schemas.microsoft.com/office/drawing/2015/10/21/chartex" xmlns:cx3="http://schemas.microsoft.com/office/drawing/2016/5/9/chartex" xmlns:cx4="http://schemas.microsoft.com/office/drawing/2016/5/10/chartex" xmlns:cx5="http://schemas.microsoft.com/office/drawing/2016/5/11/chartex" xmlns:cx6="http://schemas.microsoft.com/office/drawing/2016/5/12/chartex" xmlns:cx7="http://schemas.microsoft.com/office/drawing/2016/5/13/chartex" xmlns:cx8="http://schemas.microsoft.com/office/drawing/2016/5/14/chartex" xmlns:mc="http://schemas.openxmlformats.org/markup-compatibility/2006" xmlns:aink="http://schemas.microsoft.com/office/drawing/2016/ink" xmlns:am3d="http://schemas.microsoft.com/office/drawing/2017/model3d" xmlns:o="urn:schemas-microsoft-com:office:office" xmlns:oel="http://schemas.microsoft.com/office/2019/extlst" xmlns:r="http://schemas.openxmlformats.org/officeDocument/2006/relationships" xmlns:m="http://schemas.openxmlformats.org/officeDocument/2006/math" xmlns:v="urn:schemas-microsoft-com:vml" xmlns:wp14="http://schemas.microsoft.com/office/word/2010/wordprocessingDrawing" xmlns:wp="http://schemas.openxmlformats.org/drawingml/2006/wordprocessingDrawing" xmlns:w10="urn:schemas-microsoft-com:office:word" xmlns:w="http://schemas.openxmlformats.org/wordprocessingml/2006/main" xmlns:w14="http://schemas.microsoft.com/office/word/2010/wordml" xmlns:w15="http://schemas.microsoft.com/office/word/2012/wordml" xmlns:w16cex="http://schemas.microsoft.com/office/word/2018/wordml/cex" xmlns:w16cid="http://schemas.microsoft.com/office/word/2016/wordml/cid" xmlns:w16="http://schemas.microsoft.com/office/word/2018/wordml" xmlns:w16du="http://schemas.microsoft.com/office/word/2023/wordml/word16du" xmlns:w16sdtdh="http://schemas.microsoft.com/office/word/2020/wordml/sdtdatahash" xmlns:w16sdtfl="http://schemas.microsoft.com/office/word/2024/wordml/sdtformatlock" xmlns:w16se="http://schemas.microsoft.com/office/word/2015/wordml/symex" xmlns:wpg="http://schemas.microsoft.com/office/word/2010/wordprocessingGroup" xmlns:wpi="http://schemas.microsoft.com/office/word/2010/wordprocessingInk" xmlns:wne="http://schemas.microsoft.com/office/word/2006/wordml" xmlns:wps="http://schemas.microsoft.com/office/word/2010/wordprocessingShape" mc:Ignorable="w14 w15 w16se w16cid w16 w16cex w16sdtdh w16sdtfl w16du wp14">
   <w:tbl>
     <w:tblPr>
       <w:tblW w:w="5000" w:type="pct"/>
@@ -1874,7 +1861,6 @@
       <w:tc>
         <w:tcPr>
           <w:tcW w:w="4686" w:type="dxa"/>
-          <w:shd w:val="clear" w:color="auto" w:fill="auto"/>
           <w:vAlign w:val="center"/>
         </w:tcPr>
         <w:tbl>
@@ -1943,7 +1929,33 @@
                     <w:szCs w:val="16"/>
                     <w:lang w:val="en-US"/>
                   </w:rPr>
-                  <w:t xml:space="preserve"> This is a system generated certificate issued  under the authority of </w:t>
+                  <w:t xml:space="preserve"> This is a system generated certificate </w:t>
+                </w:r>
+                <w:proofErr w:type="gramStart"/>
+                <w:r>
+                  <w:rPr>
+                    <w:rFonts w:ascii="Yu Gothic" w:hAnsi="Yu Gothic" w:eastAsia="Yu Gothic"/>
+                    <w:b/>
+                    <w:caps/>
+                    <w:color w:val="000000" w:themeColor="text1"/>
+                    <w:sz w:val="16"/>
+                    <w:szCs w:val="16"/>
+                    <w:lang w:val="en-US"/>
+                  </w:rPr>
+                  <w:t>issued  under</w:t>
+                </w:r>
+                <w:proofErr w:type="gramEnd"/>
+                <w:r>
+                  <w:rPr>
+                    <w:rFonts w:ascii="Yu Gothic" w:hAnsi="Yu Gothic" w:eastAsia="Yu Gothic"/>
+                    <w:b/>
+                    <w:caps/>
+                    <w:color w:val="000000" w:themeColor="text1"/>
+                    <w:sz w:val="16"/>
+                    <w:szCs w:val="16"/>
+                    <w:lang w:val="en-US"/>
+                  </w:rPr>
+                  <w:t xml:space="preserve"> the authority of </w:t>
                 </w:r>
                 <w:r>
                   <w:rPr>
@@ -1955,7 +1967,7 @@
                     <w:szCs w:val="16"/>
                     <w:lang w:val="en-US"/>
                   </w:rPr>
-                  <w:t>KENPIPE</w:t>
+                  <w:t>AZIMA</w:t>
                 </w:r>
                 <w:r>
                   <w:rPr>
@@ -1969,263 +1981,6 @@
                   </w:rPr>
                   <w:t xml:space="preserve"> SACCO Society Ltd. To validate, visit any of our branches.</w:t>
                 </w:r>
-              </w:p>
-              <w:p>
-                <w:pPr>
-                  <w:pBdr>
-                    <w:top w:val="single" w:color="99CB38" w:themeColor="accent1" w:sz="24" w:space="8"/>
-                    <w:bottom w:val="single" w:color="99CB38" w:themeColor="accent1" w:sz="24" w:space="8"/>
-                  </w:pBdr>
-                  <w:spacing w:after="0" w:line="276" w:lineRule="auto"/>
-                  <w:jc w:val="center"/>
-                  <w:rPr>
-                    <w:rFonts w:ascii="Yu Gothic Medium" w:hAnsi="Yu Gothic Medium" w:eastAsia="Yu Gothic Medium" w:cs="Segoe UI"/>
-                    <w:b/>
-                    <w:color w:val="000000" w:themeColor="text1"/>
-                    <w:sz w:val="16"/>
-                    <w:szCs w:val="16"/>
-                    <w:lang w:val="en-US"/>
-                  </w:rPr>
-                </w:pPr>
-                <w:proofErr w:type="spellStart"/>
-                <w:proofErr w:type="gramStart"/>
-                <w:r>
-                  <w:rPr>
-                    <w:rFonts w:ascii="Yu Gothic Medium" w:hAnsi="Yu Gothic Medium" w:eastAsia="Yu Gothic Medium" w:cs="Segoe UI"/>
-                    <w:b/>
-                    <w:color w:val="000000" w:themeColor="text1"/>
-                    <w:sz w:val="16"/>
-                    <w:szCs w:val="16"/>
-                  </w:rPr>
-                  <w:t>SACCOName</w:t>
-                </w:r>
-                <w:proofErr w:type="spellEnd"/>
-                <w:r>
-                  <w:rPr>
-                    <w:rFonts w:ascii="Yu Gothic Medium" w:hAnsi="Yu Gothic Medium" w:eastAsia="Yu Gothic Medium" w:cs="Segoe UI"/>
-                    <w:b/>
-                    <w:color w:val="000000" w:themeColor="text1"/>
-                    <w:sz w:val="16"/>
-                    <w:szCs w:val="16"/>
-                    <w:lang w:val="en-US"/>
-                  </w:rPr>
-                  <w:t xml:space="preserve"> .</w:t>
-                </w:r>
-                <w:proofErr w:type="gramEnd"/>
-                <w:r>
-                  <w:rPr>
-                    <w:rFonts w:ascii="Yu Gothic Medium" w:hAnsi="Yu Gothic Medium" w:eastAsia="Yu Gothic Medium" w:cs="Segoe UI"/>
-                    <w:b/>
-                    <w:color w:val="000000" w:themeColor="text1"/>
-                    <w:sz w:val="16"/>
-                    <w:szCs w:val="16"/>
-                    <w:lang w:val="en-US"/>
-                  </w:rPr>
-                  <w:t xml:space="preserve"> </w:t>
-                </w:r>
-                <w:proofErr w:type="spellStart"/>
-                <w:proofErr w:type="gramStart"/>
-                <w:r>
-                  <w:rPr>
-                    <w:rFonts w:ascii="Yu Gothic Medium" w:hAnsi="Yu Gothic Medium" w:eastAsia="Yu Gothic Medium"/>
-                    <w:b/>
-                    <w:iCs/>
-                    <w:color w:val="000000" w:themeColor="text1"/>
-                    <w:sz w:val="16"/>
-                    <w:szCs w:val="16"/>
-                  </w:rPr>
-                  <w:t>PhysicalAddress</w:t>
-                </w:r>
-                <w:proofErr w:type="spellEnd"/>
-                <w:r>
-                  <w:rPr>
-                    <w:rFonts w:ascii="Yu Gothic Medium" w:hAnsi="Yu Gothic Medium" w:eastAsia="Yu Gothic Medium"/>
-                    <w:b/>
-                    <w:iCs/>
-                    <w:color w:val="000000" w:themeColor="text1"/>
-                    <w:sz w:val="16"/>
-                    <w:szCs w:val="16"/>
-                    <w:lang w:val="en-US"/>
-                  </w:rPr>
-                  <w:t xml:space="preserve"> .</w:t>
-                </w:r>
-                <w:proofErr w:type="gramEnd"/>
-                <w:r>
-                  <w:rPr>
-                    <w:rFonts w:ascii="Yu Gothic Medium" w:hAnsi="Yu Gothic Medium" w:eastAsia="Yu Gothic Medium"/>
-                    <w:b/>
-                    <w:iCs/>
-                    <w:color w:val="000000" w:themeColor="text1"/>
-                    <w:sz w:val="16"/>
-                    <w:szCs w:val="16"/>
-                    <w:lang w:val="en-US"/>
-                  </w:rPr>
-                  <w:t xml:space="preserve">  </w:t>
-                </w:r>
-                <w:proofErr w:type="spellStart"/>
-                <w:proofErr w:type="gramStart"/>
-                <w:r>
-                  <w:rPr>
-                    <w:rFonts w:ascii="Yu Gothic Medium" w:hAnsi="Yu Gothic Medium" w:eastAsia="Yu Gothic Medium"/>
-                    <w:b/>
-                    <w:iCs/>
-                    <w:color w:val="000000" w:themeColor="text1"/>
-                    <w:sz w:val="16"/>
-                    <w:szCs w:val="16"/>
-                  </w:rPr>
-                  <w:t>PostOfficeAddress</w:t>
-                </w:r>
-                <w:proofErr w:type="spellEnd"/>
-                <w:r>
-                  <w:rPr>
-                    <w:rFonts w:ascii="Yu Gothic Medium" w:hAnsi="Yu Gothic Medium" w:eastAsia="Yu Gothic Medium"/>
-                    <w:b/>
-                    <w:iCs/>
-                    <w:color w:val="000000" w:themeColor="text1"/>
-                    <w:sz w:val="16"/>
-                    <w:szCs w:val="16"/>
-                    <w:lang w:val="en-US"/>
-                  </w:rPr>
-                  <w:t xml:space="preserve">  .</w:t>
-                </w:r>
-                <w:proofErr w:type="gramEnd"/>
-                <w:r>
-                  <w:rPr>
-                    <w:rFonts w:ascii="Yu Gothic Medium" w:hAnsi="Yu Gothic Medium" w:eastAsia="Yu Gothic Medium"/>
-                    <w:b/>
-                    <w:iCs/>
-                    <w:color w:val="000000" w:themeColor="text1"/>
-                    <w:sz w:val="16"/>
-                    <w:szCs w:val="16"/>
-                    <w:lang w:val="en-US"/>
-                  </w:rPr>
-                  <w:t xml:space="preserve"> Tel: </w:t>
-                </w:r>
-                <w:proofErr w:type="gramStart"/>
-                <w:r>
-                  <w:rPr>
-                    <w:rFonts w:ascii="Yu Gothic Medium" w:hAnsi="Yu Gothic Medium" w:eastAsia="Yu Gothic Medium"/>
-                    <w:b/>
-                    <w:iCs/>
-                    <w:color w:val="000000" w:themeColor="text1"/>
-                    <w:sz w:val="16"/>
-                    <w:szCs w:val="16"/>
-                  </w:rPr>
-                  <w:t>Telephone</w:t>
-                </w:r>
-                <w:r>
-                  <w:rPr>
-                    <w:rFonts w:ascii="Yu Gothic Medium" w:hAnsi="Yu Gothic Medium" w:eastAsia="Yu Gothic Medium"/>
-                    <w:b/>
-                    <w:iCs/>
-                    <w:color w:val="000000" w:themeColor="text1"/>
-                    <w:sz w:val="16"/>
-                    <w:szCs w:val="16"/>
-                    <w:lang w:val="en-US"/>
-                  </w:rPr>
-                  <w:t xml:space="preserve"> .</w:t>
-                </w:r>
-                <w:proofErr w:type="gramEnd"/>
-                <w:r>
-                  <w:rPr>
-                    <w:rFonts w:ascii="Yu Gothic Medium" w:hAnsi="Yu Gothic Medium" w:eastAsia="Yu Gothic Medium"/>
-                    <w:b/>
-                    <w:iCs/>
-                    <w:color w:val="000000" w:themeColor="text1"/>
-                    <w:sz w:val="16"/>
-                    <w:szCs w:val="16"/>
-                    <w:lang w:val="en-US"/>
-                  </w:rPr>
-                  <w:t xml:space="preserve"> Email Address: </w:t>
-                </w:r>
-                <w:proofErr w:type="gramStart"/>
-                <w:r>
-                  <w:rPr>
-                    <w:rFonts w:ascii="Yu Gothic Medium" w:hAnsi="Yu Gothic Medium" w:eastAsia="Yu Gothic Medium"/>
-                    <w:b/>
-                    <w:iCs/>
-                    <w:color w:val="000000" w:themeColor="text1"/>
-                    <w:sz w:val="16"/>
-                    <w:szCs w:val="16"/>
-                  </w:rPr>
-                  <w:t>Email</w:t>
-                </w:r>
-                <w:r>
-                  <w:rPr>
-                    <w:rFonts w:ascii="Yu Gothic Medium" w:hAnsi="Yu Gothic Medium" w:eastAsia="Yu Gothic Medium"/>
-                    <w:b/>
-                    <w:iCs/>
-                    <w:color w:val="000000" w:themeColor="text1"/>
-                    <w:sz w:val="16"/>
-                    <w:szCs w:val="16"/>
-                    <w:lang w:val="en-US"/>
-                  </w:rPr>
-                  <w:t xml:space="preserve">  Website</w:t>
-                </w:r>
-                <w:proofErr w:type="gramEnd"/>
-                <w:r>
-                  <w:rPr>
-                    <w:rFonts w:ascii="Yu Gothic Medium" w:hAnsi="Yu Gothic Medium" w:eastAsia="Yu Gothic Medium"/>
-                    <w:b/>
-                    <w:iCs/>
-                    <w:color w:val="000000" w:themeColor="text1"/>
-                    <w:sz w:val="16"/>
-                    <w:szCs w:val="16"/>
-                    <w:lang w:val="en-US"/>
-                  </w:rPr>
-                  <w:t xml:space="preserve">: </w:t>
-                </w:r>
-                <w:r>
-                  <w:rPr>
-                    <w:rFonts w:ascii="Yu Gothic Medium" w:hAnsi="Yu Gothic Medium" w:eastAsia="Yu Gothic Medium"/>
-                    <w:b/>
-                    <w:iCs/>
-                    <w:color w:val="000000" w:themeColor="text1"/>
-                    <w:sz w:val="16"/>
-                    <w:szCs w:val="16"/>
-                  </w:rPr>
-                  <w:t>Website</w:t>
-                </w:r>
-                <w:r>
-                  <w:rPr>
-                    <w:rFonts w:ascii="Yu Gothic Medium" w:hAnsi="Yu Gothic Medium" w:eastAsia="Yu Gothic Medium"/>
-                    <w:b/>
-                    <w:iCs/>
-                    <w:color w:val="000000" w:themeColor="text1"/>
-                    <w:sz w:val="16"/>
-                    <w:szCs w:val="16"/>
-                    <w:lang w:val="en-US"/>
-                  </w:rPr>
-                  <w:t xml:space="preserve"> . </w:t>
-                </w:r>
-                <w:proofErr w:type="spellStart"/>
-                <w:r>
-                  <w:rPr>
-                    <w:rFonts w:ascii="Yu Gothic Medium" w:hAnsi="Yu Gothic Medium" w:eastAsia="Yu Gothic Medium"/>
-                    <w:b/>
-                    <w:iCs/>
-                    <w:color w:val="000000" w:themeColor="text1"/>
-                    <w:sz w:val="16"/>
-                    <w:szCs w:val="16"/>
-                  </w:rPr>
-                  <w:t>ISOCertification</w:t>
-                </w:r>
-                <w:proofErr w:type="spellEnd"/>
-              </w:p>
-              <w:p>
-                <w:pPr>
-                  <w:pStyle w:val="Footer"/>
-                  <w:spacing w:line="256" w:lineRule="auto"/>
-                  <w:jc w:val="center"/>
-                  <w:rPr>
-                    <w:b/>
-                    <w:caps/>
-                    <w:color w:val="A6A6A6" w:themeColor="background1" w:themeShade="A6"/>
-                    <w:sz w:val="16"/>
-                    <w:szCs w:val="16"/>
-                    <w:lang w:val="en-US"/>
-                  </w:rPr>
-                </w:pPr>
               </w:p>
             </w:tc>
             <w:tc>
@@ -2269,7 +2024,6 @@
       <w:tc>
         <w:tcPr>
           <w:tcW w:w="4674" w:type="dxa"/>
-          <w:shd w:val="clear" w:color="auto" w:fill="auto"/>
           <w:vAlign w:val="center"/>
         </w:tcPr>
         <w:p>
@@ -2294,7 +2048,7 @@
       <w:jc w:val="center"/>
       <w:rPr>
         <w:b/>
-        <w:color w:val="A6A6A6" w:themeColor="background1" w:themeShade="A6"/>
+        <w:color w:val="99CB38" w:themeColor="accent1"/>
         <w:sz w:val="16"/>
         <w:szCs w:val="16"/>
       </w:rPr>
@@ -2304,7 +2058,7 @@
 </file>
 
 <file path=word/footnotes.xml><?xml version="1.0" encoding="utf-8"?>
-<w:footnotes xmlns:wpc="http://schemas.microsoft.com/office/word/2010/wordprocessingCanvas" xmlns:cx="http://schemas.microsoft.com/office/drawing/2014/chartex" xmlns:cx1="http://schemas.microsoft.com/office/drawing/2015/9/8/chartex" xmlns:cx2="http://schemas.microsoft.com/office/drawing/2015/10/21/chartex" xmlns:cx3="http://schemas.microsoft.com/office/drawing/2016/5/9/chartex" xmlns:cx4="http://schemas.microsoft.com/office/drawing/2016/5/10/chartex" xmlns:cx5="http://schemas.microsoft.com/office/drawing/2016/5/11/chartex" xmlns:cx6="http://schemas.microsoft.com/office/drawing/2016/5/12/chartex" xmlns:cx7="http://schemas.microsoft.com/office/drawing/2016/5/13/chartex" xmlns:cx8="http://schemas.microsoft.com/office/drawing/2016/5/14/chartex" xmlns:mc="http://schemas.openxmlformats.org/markup-compatibility/2006" xmlns:aink="http://schemas.microsoft.com/office/drawing/2016/ink" xmlns:am3d="http://schemas.microsoft.com/office/drawing/2017/model3d" xmlns:o="urn:schemas-microsoft-com:office:office" xmlns:r="http://schemas.openxmlformats.org/officeDocument/2006/relationships" xmlns:m="http://schemas.openxmlformats.org/officeDocument/2006/math" xmlns:v="urn:schemas-microsoft-com:vml" xmlns:wp14="http://schemas.microsoft.com/office/word/2010/wordprocessingDrawing" xmlns:wp="http://schemas.openxmlformats.org/drawingml/2006/wordprocessingDrawing" xmlns:w10="urn:schemas-microsoft-com:office:word" xmlns:w="http://schemas.openxmlformats.org/wordprocessingml/2006/main" xmlns:w14="http://schemas.microsoft.com/office/word/2010/wordml" xmlns:w15="http://schemas.microsoft.com/office/word/2012/wordml" xmlns:w16cex="http://schemas.microsoft.com/office/word/2018/wordml/cex" xmlns:w16cid="http://schemas.microsoft.com/office/word/2016/wordml/cid" xmlns:w16="http://schemas.microsoft.com/office/word/2018/wordml" xmlns:w16se="http://schemas.microsoft.com/office/word/2015/wordml/symex" xmlns:wpg="http://schemas.microsoft.com/office/word/2010/wordprocessingGroup" xmlns:wpi="http://schemas.microsoft.com/office/word/2010/wordprocessingInk" xmlns:wne="http://schemas.microsoft.com/office/word/2006/wordml" xmlns:wps="http://schemas.microsoft.com/office/word/2010/wordprocessingShape" mc:Ignorable="w14 w15 w16se w16cid w16 w16cex wp14">
+<w:footnotes xmlns:wpc="http://schemas.microsoft.com/office/word/2010/wordprocessingCanvas" xmlns:cx="http://schemas.microsoft.com/office/drawing/2014/chartex" xmlns:cx1="http://schemas.microsoft.com/office/drawing/2015/9/8/chartex" xmlns:cx2="http://schemas.microsoft.com/office/drawing/2015/10/21/chartex" xmlns:cx3="http://schemas.microsoft.com/office/drawing/2016/5/9/chartex" xmlns:cx4="http://schemas.microsoft.com/office/drawing/2016/5/10/chartex" xmlns:cx5="http://schemas.microsoft.com/office/drawing/2016/5/11/chartex" xmlns:cx6="http://schemas.microsoft.com/office/drawing/2016/5/12/chartex" xmlns:cx7="http://schemas.microsoft.com/office/drawing/2016/5/13/chartex" xmlns:cx8="http://schemas.microsoft.com/office/drawing/2016/5/14/chartex" xmlns:mc="http://schemas.openxmlformats.org/markup-compatibility/2006" xmlns:aink="http://schemas.microsoft.com/office/drawing/2016/ink" xmlns:am3d="http://schemas.microsoft.com/office/drawing/2017/model3d" xmlns:o="urn:schemas-microsoft-com:office:office" xmlns:oel="http://schemas.microsoft.com/office/2019/extlst" xmlns:r="http://schemas.openxmlformats.org/officeDocument/2006/relationships" xmlns:m="http://schemas.openxmlformats.org/officeDocument/2006/math" xmlns:v="urn:schemas-microsoft-com:vml" xmlns:wp14="http://schemas.microsoft.com/office/word/2010/wordprocessingDrawing" xmlns:wp="http://schemas.openxmlformats.org/drawingml/2006/wordprocessingDrawing" xmlns:w10="urn:schemas-microsoft-com:office:word" xmlns:w="http://schemas.openxmlformats.org/wordprocessingml/2006/main" xmlns:w14="http://schemas.microsoft.com/office/word/2010/wordml" xmlns:w15="http://schemas.microsoft.com/office/word/2012/wordml" xmlns:w16cex="http://schemas.microsoft.com/office/word/2018/wordml/cex" xmlns:w16cid="http://schemas.microsoft.com/office/word/2016/wordml/cid" xmlns:w16="http://schemas.microsoft.com/office/word/2018/wordml" xmlns:w16du="http://schemas.microsoft.com/office/word/2023/wordml/word16du" xmlns:w16sdtdh="http://schemas.microsoft.com/office/word/2020/wordml/sdtdatahash" xmlns:w16sdtfl="http://schemas.microsoft.com/office/word/2024/wordml/sdtformatlock" xmlns:w16se="http://schemas.microsoft.com/office/word/2015/wordml/symex" xmlns:wpg="http://schemas.microsoft.com/office/word/2010/wordprocessingGroup" xmlns:wpi="http://schemas.microsoft.com/office/word/2010/wordprocessingInk" xmlns:wne="http://schemas.microsoft.com/office/word/2006/wordml" xmlns:wps="http://schemas.microsoft.com/office/word/2010/wordprocessingShape" mc:Ignorable="w14 w15 w16se w16cid w16 w16cex w16sdtdh w16sdtfl w16du wp14">
   <w:footnote w:type="separator" w:id="-1">
     <w:p>
       <w:pPr>
@@ -2329,53 +2083,7 @@
 </file>
 
 <file path=word/header1.xml><?xml version="1.0" encoding="utf-8"?>
-<w:hdr xmlns:wpc="http://schemas.microsoft.com/office/word/2010/wordprocessingCanvas" xmlns:cx="http://schemas.microsoft.com/office/drawing/2014/chartex" xmlns:cx1="http://schemas.microsoft.com/office/drawing/2015/9/8/chartex" xmlns:cx2="http://schemas.microsoft.com/office/drawing/2015/10/21/chartex" xmlns:cx3="http://schemas.microsoft.com/office/drawing/2016/5/9/chartex" xmlns:cx4="http://schemas.microsoft.com/office/drawing/2016/5/10/chartex" xmlns:cx5="http://schemas.microsoft.com/office/drawing/2016/5/11/chartex" xmlns:cx6="http://schemas.microsoft.com/office/drawing/2016/5/12/chartex" xmlns:cx7="http://schemas.microsoft.com/office/drawing/2016/5/13/chartex" xmlns:cx8="http://schemas.microsoft.com/office/drawing/2016/5/14/chartex" xmlns:mc="http://schemas.openxmlformats.org/markup-compatibility/2006" xmlns:aink="http://schemas.microsoft.com/office/drawing/2016/ink" xmlns:am3d="http://schemas.microsoft.com/office/drawing/2017/model3d" xmlns:o="urn:schemas-microsoft-com:office:office" xmlns:r="http://schemas.openxmlformats.org/officeDocument/2006/relationships" xmlns:m="http://schemas.openxmlformats.org/officeDocument/2006/math" xmlns:v="urn:schemas-microsoft-com:vml" xmlns:wp14="http://schemas.microsoft.com/office/word/2010/wordprocessingDrawing" xmlns:wp="http://schemas.openxmlformats.org/drawingml/2006/wordprocessingDrawing" xmlns:w10="urn:schemas-microsoft-com:office:word" xmlns:w="http://schemas.openxmlformats.org/wordprocessingml/2006/main" xmlns:w14="http://schemas.microsoft.com/office/word/2010/wordml" xmlns:w15="http://schemas.microsoft.com/office/word/2012/wordml" xmlns:w16cex="http://schemas.microsoft.com/office/word/2018/wordml/cex" xmlns:w16cid="http://schemas.microsoft.com/office/word/2016/wordml/cid" xmlns:w16="http://schemas.microsoft.com/office/word/2018/wordml" xmlns:w16se="http://schemas.microsoft.com/office/word/2015/wordml/symex" xmlns:wpg="http://schemas.microsoft.com/office/word/2010/wordprocessingGroup" xmlns:wpi="http://schemas.microsoft.com/office/word/2010/wordprocessingInk" xmlns:wne="http://schemas.microsoft.com/office/word/2006/wordml" xmlns:wps="http://schemas.microsoft.com/office/word/2010/wordprocessingShape" mc:Ignorable="w14 w15 w16se w16cid w16 w16cex wp14">
-  <w:p>
-    <w:pPr>
-      <w:pStyle w:val="Header"/>
-    </w:pPr>
-    <w:r>
-      <w:rPr>
-        <w:noProof/>
-      </w:rPr>
-      <w:pict w14:anchorId="34A944AB">
-        <v:shapetype id="_x0000_t136" coordsize="21600,21600" o:spt="136" adj="10800" path="m@7,l@8,m@5,21600l@6,21600e">
-          <v:formulas>
-            <v:f eqn="sum #0 0 10800"/>
-            <v:f eqn="prod #0 2 1"/>
-            <v:f eqn="sum 21600 0 @1"/>
-            <v:f eqn="sum 0 0 @2"/>
-            <v:f eqn="sum 21600 0 @3"/>
-            <v:f eqn="if @0 @3 0"/>
-            <v:f eqn="if @0 21600 @1"/>
-            <v:f eqn="if @0 0 @2"/>
-            <v:f eqn="if @0 @4 21600"/>
-            <v:f eqn="mid @5 @6"/>
-            <v:f eqn="mid @8 @5"/>
-            <v:f eqn="mid @7 @8"/>
-            <v:f eqn="mid @6 @7"/>
-            <v:f eqn="sum @6 0 @5"/>
-          </v:formulas>
-          <v:path textpathok="t" o:connecttype="custom" o:connectlocs="@9,0;@10,10800;@11,21600;@12,10800" o:connectangles="270,180,90,0"/>
-          <v:textpath on="t" fitshape="t"/>
-          <v:handles>
-            <v:h position="#0,bottomRight" xrange="6629,14971"/>
-          </v:handles>
-          <o:lock v:ext="edit" text="t" shapetype="t"/>
-        </v:shapetype>
-        <v:shape id="PowerPlusWaterMarkObject101605501" style="position:absolute;margin-left:0;margin-top:0;width:231.75pt;height:44.25pt;z-index:-251655168;mso-position-horizontal:center;mso-position-horizontal-relative:margin;mso-position-vertical:center;mso-position-vertical-relative:margin" o:spid="_x0000_s2052" o:allowincell="f" fillcolor="silver" stroked="f" type="#_x0000_t136">
-          <v:fill opacity=".5"/>
-          <v:textpath style="font-family:&quot;Calibri&quot;" string="KENPIPE SACCO"/>
-          <w10:wrap anchorx="margin" anchory="margin"/>
-        </v:shape>
-      </w:pict>
-    </w:r>
-  </w:p>
-</w:hdr>
-</file>
-
-<file path=word/header2.xml><?xml version="1.0" encoding="utf-8"?>
-<w:hdr xmlns:a="http://schemas.openxmlformats.org/drawingml/2006/main" xmlns:wpc="http://schemas.microsoft.com/office/word/2010/wordprocessingCanvas" xmlns:cx="http://schemas.microsoft.com/office/drawing/2014/chartex" xmlns:cx1="http://schemas.microsoft.com/office/drawing/2015/9/8/chartex" xmlns:cx2="http://schemas.microsoft.com/office/drawing/2015/10/21/chartex" xmlns:cx3="http://schemas.microsoft.com/office/drawing/2016/5/9/chartex" xmlns:cx4="http://schemas.microsoft.com/office/drawing/2016/5/10/chartex" xmlns:cx5="http://schemas.microsoft.com/office/drawing/2016/5/11/chartex" xmlns:cx6="http://schemas.microsoft.com/office/drawing/2016/5/12/chartex" xmlns:cx7="http://schemas.microsoft.com/office/drawing/2016/5/13/chartex" xmlns:cx8="http://schemas.microsoft.com/office/drawing/2016/5/14/chartex" xmlns:mc="http://schemas.openxmlformats.org/markup-compatibility/2006" xmlns:aink="http://schemas.microsoft.com/office/drawing/2016/ink" xmlns:am3d="http://schemas.microsoft.com/office/drawing/2017/model3d" xmlns:o="urn:schemas-microsoft-com:office:office" xmlns:r="http://schemas.openxmlformats.org/officeDocument/2006/relationships" xmlns:m="http://schemas.openxmlformats.org/officeDocument/2006/math" xmlns:v="urn:schemas-microsoft-com:vml" xmlns:wp14="http://schemas.microsoft.com/office/word/2010/wordprocessingDrawing" xmlns:wp="http://schemas.openxmlformats.org/drawingml/2006/wordprocessingDrawing" xmlns:w10="urn:schemas-microsoft-com:office:word" xmlns:w="http://schemas.openxmlformats.org/wordprocessingml/2006/main" xmlns:w14="http://schemas.microsoft.com/office/word/2010/wordml" xmlns:w15="http://schemas.microsoft.com/office/word/2012/wordml" xmlns:w16cex="http://schemas.microsoft.com/office/word/2018/wordml/cex" xmlns:w16cid="http://schemas.microsoft.com/office/word/2016/wordml/cid" xmlns:w16="http://schemas.microsoft.com/office/word/2018/wordml" xmlns:w16se="http://schemas.microsoft.com/office/word/2015/wordml/symex" xmlns:wpg="http://schemas.microsoft.com/office/word/2010/wordprocessingGroup" xmlns:wpi="http://schemas.microsoft.com/office/word/2010/wordprocessingInk" xmlns:wne="http://schemas.microsoft.com/office/word/2006/wordml" xmlns:wps="http://schemas.microsoft.com/office/word/2010/wordprocessingShape" mc:Ignorable="w14 w15 w16se w16cid w16 w16cex wp14">
+<w:hdr xmlns:a="http://schemas.openxmlformats.org/drawingml/2006/main" xmlns:wpc="http://schemas.microsoft.com/office/word/2010/wordprocessingCanvas" xmlns:cx="http://schemas.microsoft.com/office/drawing/2014/chartex" xmlns:cx1="http://schemas.microsoft.com/office/drawing/2015/9/8/chartex" xmlns:cx2="http://schemas.microsoft.com/office/drawing/2015/10/21/chartex" xmlns:cx3="http://schemas.microsoft.com/office/drawing/2016/5/9/chartex" xmlns:cx4="http://schemas.microsoft.com/office/drawing/2016/5/10/chartex" xmlns:cx5="http://schemas.microsoft.com/office/drawing/2016/5/11/chartex" xmlns:cx6="http://schemas.microsoft.com/office/drawing/2016/5/12/chartex" xmlns:cx7="http://schemas.microsoft.com/office/drawing/2016/5/13/chartex" xmlns:cx8="http://schemas.microsoft.com/office/drawing/2016/5/14/chartex" xmlns:mc="http://schemas.openxmlformats.org/markup-compatibility/2006" xmlns:aink="http://schemas.microsoft.com/office/drawing/2016/ink" xmlns:am3d="http://schemas.microsoft.com/office/drawing/2017/model3d" xmlns:o="urn:schemas-microsoft-com:office:office" xmlns:oel="http://schemas.microsoft.com/office/2019/extlst" xmlns:r="http://schemas.openxmlformats.org/officeDocument/2006/relationships" xmlns:m="http://schemas.openxmlformats.org/officeDocument/2006/math" xmlns:v="urn:schemas-microsoft-com:vml" xmlns:wp14="http://schemas.microsoft.com/office/word/2010/wordprocessingDrawing" xmlns:wp="http://schemas.openxmlformats.org/drawingml/2006/wordprocessingDrawing" xmlns:w10="urn:schemas-microsoft-com:office:word" xmlns:w="http://schemas.openxmlformats.org/wordprocessingml/2006/main" xmlns:w14="http://schemas.microsoft.com/office/word/2010/wordml" xmlns:w15="http://schemas.microsoft.com/office/word/2012/wordml" xmlns:w16cex="http://schemas.microsoft.com/office/word/2018/wordml/cex" xmlns:w16cid="http://schemas.microsoft.com/office/word/2016/wordml/cid" xmlns:w16="http://schemas.microsoft.com/office/word/2018/wordml" xmlns:w16du="http://schemas.microsoft.com/office/word/2023/wordml/word16du" xmlns:w16sdtdh="http://schemas.microsoft.com/office/word/2020/wordml/sdtdatahash" xmlns:w16sdtfl="http://schemas.microsoft.com/office/word/2024/wordml/sdtformatlock" xmlns:w16se="http://schemas.microsoft.com/office/word/2015/wordml/symex" xmlns:wpg="http://schemas.microsoft.com/office/word/2010/wordprocessingGroup" xmlns:wpi="http://schemas.microsoft.com/office/word/2010/wordprocessingInk" xmlns:wne="http://schemas.microsoft.com/office/word/2006/wordml" xmlns:wps="http://schemas.microsoft.com/office/word/2010/wordprocessingShape" mc:Ignorable="w14 w15 w16se w16cid w16 w16cex w16sdtdh w16sdtfl w16du wp14">
   <w:p>
     <w:pPr>
       <w:pStyle w:val="Header"/>
@@ -2399,15 +2107,15 @@
       <mc:AlternateContent>
         <mc:Choice Requires="wpg">
           <w:drawing>
-            <wp:anchor distT="0" distB="0" distL="114300" distR="114300" simplePos="0" relativeHeight="251657216" behindDoc="0" locked="0" layoutInCell="1" allowOverlap="1" wp14:editId="424699EC" wp14:anchorId="1041BAB4">
+            <wp:anchor distT="0" distB="0" distL="114300" distR="114300" simplePos="0" relativeHeight="251657216" behindDoc="0" locked="0" layoutInCell="1" allowOverlap="1" wp14:editId="410492C3" wp14:anchorId="1041BAB4">
               <wp:simplePos x="0" y="0"/>
               <wp:positionH relativeFrom="page">
-                <wp:posOffset>247650</wp:posOffset>
+                <wp:posOffset>238125</wp:posOffset>
               </wp:positionH>
               <wp:positionV relativeFrom="page">
-                <wp:posOffset>352425</wp:posOffset>
+                <wp:posOffset>314325</wp:posOffset>
               </wp:positionV>
-              <wp:extent cx="1910080" cy="1414145"/>
+              <wp:extent cx="1700529" cy="1166495"/>
               <wp:effectExtent l="0" t="0" r="0" b="0"/>
               <wp:wrapNone/>
               <wp:docPr id="158" name="Group 158"/>
@@ -2419,9 +2127,9 @@
                     <wpg:grpSpPr>
                       <a:xfrm>
                         <a:off x="0" y="0"/>
-                        <a:ext cx="1910080" cy="1414145"/>
-                        <a:chOff x="0" y="-114357"/>
-                        <a:chExt cx="1910366" cy="1414847"/>
+                        <a:ext cx="1700528" cy="1166495"/>
+                        <a:chOff x="0" y="-142946"/>
+                        <a:chExt cx="1700784" cy="1167074"/>
                       </a:xfrm>
                     </wpg:grpSpPr>
                     <wpg:grpSp>
@@ -2429,10 +2137,10 @@
                       <wpg:cNvGrpSpPr/>
                       <wpg:grpSpPr>
                         <a:xfrm>
-                          <a:off x="0" y="-114357"/>
-                          <a:ext cx="1910366" cy="1414847"/>
-                          <a:chOff x="0" y="-114357"/>
-                          <a:chExt cx="1910366" cy="1414847"/>
+                          <a:off x="0" y="-142946"/>
+                          <a:ext cx="1700784" cy="1167074"/>
+                          <a:chOff x="0" y="-142946"/>
+                          <a:chExt cx="1700784" cy="1167074"/>
                         </a:xfrm>
                       </wpg:grpSpPr>
                       <wps:wsp>
@@ -2585,7 +2293,7 @@
                         <wps:cNvSpPr/>
                         <wps:spPr>
                           <a:xfrm>
-                            <a:off x="438182" y="276362"/>
+                            <a:off x="104757" y="-142946"/>
                             <a:ext cx="1472184" cy="1024128"/>
                           </a:xfrm>
                           <a:prstGeom prst="rect">
@@ -2675,7 +2383,6 @@
                               <w:dataBinding w:prefixMappings="xmlns:ns0='urn:microsoft-dynamics-nav/reports/Finance_Share_Certificate/52186157/'" w:xpath="/ns0:NavWordReportXmlPart[1]/ns0:Members[1]/ns0:No[1]" w:storeItemID="{31E59954-CB1B-4E80-8940-F143CD0AE04B}"/>
                               <w:text/>
                             </w:sdtPr>
-                            <w:sdtEndPr/>
                             <w:sdtContent>
                               <w:p>
                                 <w:pPr>
@@ -2722,8 +2429,8 @@
         </mc:Choice>
         <mc:Fallback>
           <w:pict>
-            <v:group id="Group 158" style="position:absolute;margin-left:19.5pt;margin-top:27.75pt;width:150.4pt;height:111.35pt;z-index:251657216;mso-position-horizontal-relative:page;mso-position-vertical-relative:page;mso-width-relative:margin;mso-height-relative:margin" coordsize="19103,14148" coordorigin=",-1143" o:spid="_x0000_s1031" o:gfxdata="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" w14:anchorId="1041BAB4">
-              <v:group id="Group 159" style="position:absolute;top:-1143;width:19103;height:14147" coordsize="19103,14148" coordorigin=",-1143" o:spid="_x0000_s1032" o:gfxdata="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">
+            <v:group id="Group 158" style="position:absolute;margin-left:18.75pt;margin-top:24.75pt;width:133.9pt;height:91.85pt;z-index:251657216;mso-position-horizontal-relative:page;mso-position-vertical-relative:page;mso-width-relative:margin;mso-height-relative:margin" coordsize="17007,11670" coordorigin=",-1429" o:spid="_x0000_s1031" o:gfxdata="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" w14:anchorId="1041BAB4">
+              <v:group id="Group 159" style="position:absolute;top:-1429;width:17007;height:11670" coordsize="17007,11670" coordorigin=",-1429" o:spid="_x0000_s1032" o:gfxdata="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">
                 <v:rect id="Rectangle 160" style="position:absolute;width:17007;height:10241;visibility:visible;mso-wrap-style:square;v-text-anchor:middle" o:spid="_x0000_s1033" fillcolor="white [3212]" stroked="f" strokeweight="1pt" o:gfxdata="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">
                   <v:fill opacity="0"/>
                 </v:rect>
@@ -2731,7 +2438,7 @@
                   <v:stroke joinstyle="miter"/>
                   <v:path arrowok="t" o:connecttype="custom" o:connectlocs="0,0;1463040,0;910508,376493;0,1014984;0,0" o:connectangles="0,0,0,0,0"/>
                 </v:shape>
-                <v:rect id="Rectangle 162" style="position:absolute;left:4381;top:2763;width:14722;height:10241;visibility:visible;mso-wrap-style:square;v-text-anchor:middle" o:spid="_x0000_s1035" stroked="f" strokeweight="1pt" o:gfxdata="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">
+                <v:rect id="Rectangle 162" style="position:absolute;left:1047;top:-1429;width:14722;height:10240;visibility:visible;mso-wrap-style:square;v-text-anchor:middle" o:spid="_x0000_s1035" stroked="f" strokeweight="1pt" o:gfxdata="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">
                   <v:fill type="frame" o:title="" recolor="t" rotate="t" r:id="rId2"/>
                 </v:rect>
               </v:group>
@@ -2759,7 +2466,6 @@
                         <w:dataBinding w:prefixMappings="xmlns:ns0='urn:microsoft-dynamics-nav/reports/Finance_Share_Certificate/52186157/'" w:xpath="/ns0:NavWordReportXmlPart[1]/ns0:Members[1]/ns0:No[1]" w:storeItemID="{31E59954-CB1B-4E80-8940-F143CD0AE04B}"/>
                         <w:text/>
                       </w:sdtPr>
-                      <w:sdtEndPr/>
                       <w:sdtContent>
                         <w:p>
                           <w:pPr>
@@ -2792,94 +2498,12 @@
         </mc:Fallback>
       </mc:AlternateContent>
     </w:r>
-    <w:r>
-      <w:rPr>
-        <w:noProof/>
-      </w:rPr>
-      <w:pict w14:anchorId="603D049F">
-        <v:shapetype id="_x0000_t136" coordsize="21600,21600" o:spt="136" adj="10800" path="m@7,l@8,m@5,21600l@6,21600e">
-          <v:formulas>
-            <v:f eqn="sum #0 0 10800"/>
-            <v:f eqn="prod #0 2 1"/>
-            <v:f eqn="sum 21600 0 @1"/>
-            <v:f eqn="sum 0 0 @2"/>
-            <v:f eqn="sum 21600 0 @3"/>
-            <v:f eqn="if @0 @3 0"/>
-            <v:f eqn="if @0 21600 @1"/>
-            <v:f eqn="if @0 0 @2"/>
-            <v:f eqn="if @0 @4 21600"/>
-            <v:f eqn="mid @5 @6"/>
-            <v:f eqn="mid @8 @5"/>
-            <v:f eqn="mid @7 @8"/>
-            <v:f eqn="mid @6 @7"/>
-            <v:f eqn="sum @6 0 @5"/>
-          </v:formulas>
-          <v:path textpathok="t" o:connecttype="custom" o:connectlocs="@9,0;@10,10800;@11,21600;@12,10800" o:connectangles="270,180,90,0"/>
-          <v:textpath on="t" fitshape="t"/>
-          <v:handles>
-            <v:h position="#0,bottomRight" xrange="6629,14971"/>
-          </v:handles>
-          <o:lock v:ext="edit" text="t" shapetype="t"/>
-        </v:shapetype>
-        <v:shape id="PowerPlusWaterMarkObject101605502" style="position:absolute;margin-left:0;margin-top:0;width:231.75pt;height:44.25pt;z-index:-251653120;mso-position-horizontal:center;mso-position-horizontal-relative:margin;mso-position-vertical:center;mso-position-vertical-relative:margin" o:spid="_x0000_s2053" o:allowincell="f" fillcolor="silver" stroked="f" type="#_x0000_t136">
-          <v:fill opacity=".5"/>
-          <v:textpath style="font-family:&quot;Calibri&quot;" string="KENPIPE SACCO"/>
-          <w10:wrap anchorx="margin" anchory="margin"/>
-        </v:shape>
-      </w:pict>
-    </w:r>
-  </w:p>
-</w:hdr>
-</file>
-
-<file path=word/header3.xml><?xml version="1.0" encoding="utf-8"?>
-<w:hdr xmlns:wpc="http://schemas.microsoft.com/office/word/2010/wordprocessingCanvas" xmlns:cx="http://schemas.microsoft.com/office/drawing/2014/chartex" xmlns:cx1="http://schemas.microsoft.com/office/drawing/2015/9/8/chartex" xmlns:cx2="http://schemas.microsoft.com/office/drawing/2015/10/21/chartex" xmlns:cx3="http://schemas.microsoft.com/office/drawing/2016/5/9/chartex" xmlns:cx4="http://schemas.microsoft.com/office/drawing/2016/5/10/chartex" xmlns:cx5="http://schemas.microsoft.com/office/drawing/2016/5/11/chartex" xmlns:cx6="http://schemas.microsoft.com/office/drawing/2016/5/12/chartex" xmlns:cx7="http://schemas.microsoft.com/office/drawing/2016/5/13/chartex" xmlns:cx8="http://schemas.microsoft.com/office/drawing/2016/5/14/chartex" xmlns:mc="http://schemas.openxmlformats.org/markup-compatibility/2006" xmlns:aink="http://schemas.microsoft.com/office/drawing/2016/ink" xmlns:am3d="http://schemas.microsoft.com/office/drawing/2017/model3d" xmlns:o="urn:schemas-microsoft-com:office:office" xmlns:r="http://schemas.openxmlformats.org/officeDocument/2006/relationships" xmlns:m="http://schemas.openxmlformats.org/officeDocument/2006/math" xmlns:v="urn:schemas-microsoft-com:vml" xmlns:wp14="http://schemas.microsoft.com/office/word/2010/wordprocessingDrawing" xmlns:wp="http://schemas.openxmlformats.org/drawingml/2006/wordprocessingDrawing" xmlns:w10="urn:schemas-microsoft-com:office:word" xmlns:w="http://schemas.openxmlformats.org/wordprocessingml/2006/main" xmlns:w14="http://schemas.microsoft.com/office/word/2010/wordml" xmlns:w15="http://schemas.microsoft.com/office/word/2012/wordml" xmlns:w16cex="http://schemas.microsoft.com/office/word/2018/wordml/cex" xmlns:w16cid="http://schemas.microsoft.com/office/word/2016/wordml/cid" xmlns:w16="http://schemas.microsoft.com/office/word/2018/wordml" xmlns:w16se="http://schemas.microsoft.com/office/word/2015/wordml/symex" xmlns:wpg="http://schemas.microsoft.com/office/word/2010/wordprocessingGroup" xmlns:wpi="http://schemas.microsoft.com/office/word/2010/wordprocessingInk" xmlns:wne="http://schemas.microsoft.com/office/word/2006/wordml" xmlns:wps="http://schemas.microsoft.com/office/word/2010/wordprocessingShape" mc:Ignorable="w14 w15 w16se w16cid w16 w16cex wp14">
-  <w:p>
-    <w:pPr>
-      <w:pStyle w:val="Header"/>
-    </w:pPr>
-    <w:r>
-      <w:rPr>
-        <w:noProof/>
-      </w:rPr>
-      <w:pict w14:anchorId="14FB1E19">
-        <v:shapetype id="_x0000_t136" coordsize="21600,21600" o:spt="136" adj="10800" path="m@7,l@8,m@5,21600l@6,21600e">
-          <v:formulas>
-            <v:f eqn="sum #0 0 10800"/>
-            <v:f eqn="prod #0 2 1"/>
-            <v:f eqn="sum 21600 0 @1"/>
-            <v:f eqn="sum 0 0 @2"/>
-            <v:f eqn="sum 21600 0 @3"/>
-            <v:f eqn="if @0 @3 0"/>
-            <v:f eqn="if @0 21600 @1"/>
-            <v:f eqn="if @0 0 @2"/>
-            <v:f eqn="if @0 @4 21600"/>
-            <v:f eqn="mid @5 @6"/>
-            <v:f eqn="mid @8 @5"/>
-            <v:f eqn="mid @7 @8"/>
-            <v:f eqn="mid @6 @7"/>
-            <v:f eqn="sum @6 0 @5"/>
-          </v:formulas>
-          <v:path textpathok="t" o:connecttype="custom" o:connectlocs="@9,0;@10,10800;@11,21600;@12,10800" o:connectangles="270,180,90,0"/>
-          <v:textpath on="t" fitshape="t"/>
-          <v:handles>
-            <v:h position="#0,bottomRight" xrange="6629,14971"/>
-          </v:handles>
-          <o:lock v:ext="edit" text="t" shapetype="t"/>
-        </v:shapetype>
-        <v:shape id="PowerPlusWaterMarkObject101605500" style="position:absolute;margin-left:0;margin-top:0;width:231.75pt;height:44.25pt;z-index:-251657216;mso-position-horizontal:center;mso-position-horizontal-relative:margin;mso-position-vertical:center;mso-position-vertical-relative:margin" o:spid="_x0000_s2051" o:allowincell="f" fillcolor="silver" stroked="f" type="#_x0000_t136">
-          <v:fill opacity=".5"/>
-          <v:textpath style="font-family:&quot;Calibri&quot;" string="KENPIPE SACCO"/>
-          <w10:wrap anchorx="margin" anchory="margin"/>
-        </v:shape>
-      </w:pict>
-    </w:r>
   </w:p>
 </w:hdr>
 </file>
 
 <file path=word/styles.xml><?xml version="1.0" encoding="utf-8"?>
-<w:styles xmlns:mc="http://schemas.openxmlformats.org/markup-compatibility/2006" xmlns:r="http://schemas.openxmlformats.org/officeDocument/2006/relationships" xmlns:w="http://schemas.openxmlformats.org/wordprocessingml/2006/main" xmlns:w14="http://schemas.microsoft.com/office/word/2010/wordml" xmlns:w15="http://schemas.microsoft.com/office/word/2012/wordml" xmlns:w16cex="http://schemas.microsoft.com/office/word/2018/wordml/cex" xmlns:w16cid="http://schemas.microsoft.com/office/word/2016/wordml/cid" xmlns:w16="http://schemas.microsoft.com/office/word/2018/wordml" xmlns:w16se="http://schemas.microsoft.com/office/word/2015/wordml/symex" mc:Ignorable="w14 w15 w16se w16cid w16 w16cex">
+<w:styles xmlns:mc="http://schemas.openxmlformats.org/markup-compatibility/2006" xmlns:r="http://schemas.openxmlformats.org/officeDocument/2006/relationships" xmlns:w="http://schemas.openxmlformats.org/wordprocessingml/2006/main" xmlns:w14="http://schemas.microsoft.com/office/word/2010/wordml" xmlns:w15="http://schemas.microsoft.com/office/word/2012/wordml" xmlns:w16cex="http://schemas.microsoft.com/office/word/2018/wordml/cex" xmlns:w16cid="http://schemas.microsoft.com/office/word/2016/wordml/cid" xmlns:w16="http://schemas.microsoft.com/office/word/2018/wordml" xmlns:w16du="http://schemas.microsoft.com/office/word/2023/wordml/word16du" xmlns:w16sdtdh="http://schemas.microsoft.com/office/word/2020/wordml/sdtdatahash" xmlns:w16sdtfl="http://schemas.microsoft.com/office/word/2024/wordml/sdtformatlock" xmlns:w16se="http://schemas.microsoft.com/office/word/2015/wordml/symex" mc:Ignorable="w14 w15 w16se w16cid w16 w16cex w16sdtdh w16sdtfl w16du">
   <w:docDefaults>
     <w:rPrDefault>
       <w:rPr>
@@ -3352,7 +2976,7 @@
 </file>
 
 <file path=word/glossary/document.xml><?xml version="1.0" encoding="utf-8"?>
-<w:glossaryDocument xmlns:wpc="http://schemas.microsoft.com/office/word/2010/wordprocessingCanvas" xmlns:cx="http://schemas.microsoft.com/office/drawing/2014/chartex" xmlns:cx1="http://schemas.microsoft.com/office/drawing/2015/9/8/chartex" xmlns:cx2="http://schemas.microsoft.com/office/drawing/2015/10/21/chartex" xmlns:cx3="http://schemas.microsoft.com/office/drawing/2016/5/9/chartex" xmlns:cx4="http://schemas.microsoft.com/office/drawing/2016/5/10/chartex" xmlns:cx5="http://schemas.microsoft.com/office/drawing/2016/5/11/chartex" xmlns:cx6="http://schemas.microsoft.com/office/drawing/2016/5/12/chartex" xmlns:cx7="http://schemas.microsoft.com/office/drawing/2016/5/13/chartex" xmlns:cx8="http://schemas.microsoft.com/office/drawing/2016/5/14/chartex" xmlns:mc="http://schemas.openxmlformats.org/markup-compatibility/2006" xmlns:aink="http://schemas.microsoft.com/office/drawing/2016/ink" xmlns:am3d="http://schemas.microsoft.com/office/drawing/2017/model3d" xmlns:o="urn:schemas-microsoft-com:office:office" xmlns:r="http://schemas.openxmlformats.org/officeDocument/2006/relationships" xmlns:m="http://schemas.openxmlformats.org/officeDocument/2006/math" xmlns:v="urn:schemas-microsoft-com:vml" xmlns:wp14="http://schemas.microsoft.com/office/word/2010/wordprocessingDrawing" xmlns:wp="http://schemas.openxmlformats.org/drawingml/2006/wordprocessingDrawing" xmlns:w10="urn:schemas-microsoft-com:office:word" xmlns:w="http://schemas.openxmlformats.org/wordprocessingml/2006/main" xmlns:w14="http://schemas.microsoft.com/office/word/2010/wordml" xmlns:w15="http://schemas.microsoft.com/office/word/2012/wordml" xmlns:w16cex="http://schemas.microsoft.com/office/word/2018/wordml/cex" xmlns:w16cid="http://schemas.microsoft.com/office/word/2016/wordml/cid" xmlns:w16="http://schemas.microsoft.com/office/word/2018/wordml" xmlns:w16se="http://schemas.microsoft.com/office/word/2015/wordml/symex" xmlns:wpg="http://schemas.microsoft.com/office/word/2010/wordprocessingGroup" xmlns:wpi="http://schemas.microsoft.com/office/word/2010/wordprocessingInk" xmlns:wne="http://schemas.microsoft.com/office/word/2006/wordml" xmlns:wps="http://schemas.microsoft.com/office/word/2010/wordprocessingShape" mc:Ignorable="w14 w15 w16se w16cid w16 w16cex wp14">
+<w:glossaryDocument xmlns:wpc="http://schemas.microsoft.com/office/word/2010/wordprocessingCanvas" xmlns:cx="http://schemas.microsoft.com/office/drawing/2014/chartex" xmlns:cx1="http://schemas.microsoft.com/office/drawing/2015/9/8/chartex" xmlns:cx2="http://schemas.microsoft.com/office/drawing/2015/10/21/chartex" xmlns:cx3="http://schemas.microsoft.com/office/drawing/2016/5/9/chartex" xmlns:cx4="http://schemas.microsoft.com/office/drawing/2016/5/10/chartex" xmlns:cx5="http://schemas.microsoft.com/office/drawing/2016/5/11/chartex" xmlns:cx6="http://schemas.microsoft.com/office/drawing/2016/5/12/chartex" xmlns:cx7="http://schemas.microsoft.com/office/drawing/2016/5/13/chartex" xmlns:cx8="http://schemas.microsoft.com/office/drawing/2016/5/14/chartex" xmlns:mc="http://schemas.openxmlformats.org/markup-compatibility/2006" xmlns:aink="http://schemas.microsoft.com/office/drawing/2016/ink" xmlns:am3d="http://schemas.microsoft.com/office/drawing/2017/model3d" xmlns:o="urn:schemas-microsoft-com:office:office" xmlns:oel="http://schemas.microsoft.com/office/2019/extlst" xmlns:r="http://schemas.openxmlformats.org/officeDocument/2006/relationships" xmlns:m="http://schemas.openxmlformats.org/officeDocument/2006/math" xmlns:v="urn:schemas-microsoft-com:vml" xmlns:wp14="http://schemas.microsoft.com/office/word/2010/wordprocessingDrawing" xmlns:wp="http://schemas.openxmlformats.org/drawingml/2006/wordprocessingDrawing" xmlns:w10="urn:schemas-microsoft-com:office:word" xmlns:w="http://schemas.openxmlformats.org/wordprocessingml/2006/main" xmlns:w14="http://schemas.microsoft.com/office/word/2010/wordml" xmlns:w15="http://schemas.microsoft.com/office/word/2012/wordml" xmlns:w16cex="http://schemas.microsoft.com/office/word/2018/wordml/cex" xmlns:w16cid="http://schemas.microsoft.com/office/word/2016/wordml/cid" xmlns:w16="http://schemas.microsoft.com/office/word/2018/wordml" xmlns:w16du="http://schemas.microsoft.com/office/word/2023/wordml/word16du" xmlns:w16sdtdh="http://schemas.microsoft.com/office/word/2020/wordml/sdtdatahash" xmlns:w16sdtfl="http://schemas.microsoft.com/office/word/2024/wordml/sdtformatlock" xmlns:w16se="http://schemas.microsoft.com/office/word/2015/wordml/symex" xmlns:wpg="http://schemas.microsoft.com/office/word/2010/wordprocessingGroup" xmlns:wpi="http://schemas.microsoft.com/office/word/2010/wordprocessingInk" xmlns:wne="http://schemas.microsoft.com/office/word/2006/wordml" xmlns:wps="http://schemas.microsoft.com/office/word/2010/wordprocessingShape" mc:Ignorable="w14 w15 w16se w16cid w16 w16cex w16sdtdh w16sdtfl w16du wp14">
   <w:docParts>
     <w:docPart>
       <w:docPartPr>
@@ -3388,20 +3012,20 @@
 </file>
 
 <file path=word/glossary/fontTable.xml><?xml version="1.0" encoding="utf-8"?>
-<w:fonts xmlns:mc="http://schemas.openxmlformats.org/markup-compatibility/2006" xmlns:r="http://schemas.openxmlformats.org/officeDocument/2006/relationships" xmlns:w="http://schemas.openxmlformats.org/wordprocessingml/2006/main" xmlns:w14="http://schemas.microsoft.com/office/word/2010/wordml" xmlns:w15="http://schemas.microsoft.com/office/word/2012/wordml" xmlns:w16cex="http://schemas.microsoft.com/office/word/2018/wordml/cex" xmlns:w16cid="http://schemas.microsoft.com/office/word/2016/wordml/cid" xmlns:w16="http://schemas.microsoft.com/office/word/2018/wordml" xmlns:w16se="http://schemas.microsoft.com/office/word/2015/wordml/symex" mc:Ignorable="w14 w15 w16se w16cid w16 w16cex">
+<w:fonts xmlns:mc="http://schemas.openxmlformats.org/markup-compatibility/2006" xmlns:r="http://schemas.openxmlformats.org/officeDocument/2006/relationships" xmlns:w="http://schemas.openxmlformats.org/wordprocessingml/2006/main" xmlns:w14="http://schemas.microsoft.com/office/word/2010/wordml" xmlns:w15="http://schemas.microsoft.com/office/word/2012/wordml" xmlns:w16cex="http://schemas.microsoft.com/office/word/2018/wordml/cex" xmlns:w16cid="http://schemas.microsoft.com/office/word/2016/wordml/cid" xmlns:w16="http://schemas.microsoft.com/office/word/2018/wordml" xmlns:w16du="http://schemas.microsoft.com/office/word/2023/wordml/word16du" xmlns:w16sdtdh="http://schemas.microsoft.com/office/word/2020/wordml/sdtdatahash" xmlns:w16sdtfl="http://schemas.microsoft.com/office/word/2024/wordml/sdtformatlock" xmlns:w16se="http://schemas.microsoft.com/office/word/2015/wordml/symex" mc:Ignorable="w14 w15 w16se w16cid w16 w16cex w16sdtdh w16sdtfl w16du">
   <w:font w:name="Calibri">
     <w:panose1 w:val="020F0502020204030204"/>
     <w:charset w:val="00"/>
     <w:family w:val="swiss"/>
     <w:pitch w:val="variable"/>
-    <w:sig w:usb0="E0002AFF" w:usb1="4000ACFF" w:usb2="00000001" w:usb3="00000000" w:csb0="000001FF" w:csb1="00000000"/>
+    <w:sig w:usb0="E4002EFF" w:usb1="C200ACFF" w:usb2="00000009" w:usb3="00000000" w:csb0="000001FF" w:csb1="00000000"/>
   </w:font>
   <w:font w:name="Times New Roman">
     <w:panose1 w:val="02020603050405020304"/>
     <w:charset w:val="00"/>
     <w:family w:val="roman"/>
     <w:pitch w:val="variable"/>
-    <w:sig w:usb0="E0002AFF" w:usb1="C0007843" w:usb2="00000009" w:usb3="00000000" w:csb0="000001FF" w:csb1="00000000"/>
+    <w:sig w:usb0="E0002EFF" w:usb1="C000785B" w:usb2="00000009" w:usb3="00000000" w:csb0="000001FF" w:csb1="00000000"/>
   </w:font>
   <w:font w:name="Book Antiqua">
     <w:panose1 w:val="02040602050305030304"/>
@@ -3422,7 +3046,7 @@
     <w:charset w:val="00"/>
     <w:family w:val="swiss"/>
     <w:pitch w:val="variable"/>
-    <w:sig w:usb0="E0002AFF" w:usb1="C0007843" w:usb2="00000009" w:usb3="00000000" w:csb0="000001FF" w:csb1="00000000"/>
+    <w:sig w:usb0="E0002EFF" w:usb1="C000785B" w:usb2="00000009" w:usb3="00000000" w:csb0="000001FF" w:csb1="00000000"/>
   </w:font>
   <w:font w:name="Yu Gothic UI Semibold">
     <w:panose1 w:val="020B0700000000000000"/>
@@ -3458,13 +3082,25 @@
     <w:charset w:val="00"/>
     <w:family w:val="swiss"/>
     <w:pitch w:val="variable"/>
-    <w:sig w:usb0="A0002AEF" w:usb1="4000207B" w:usb2="00000000" w:usb3="00000000" w:csb0="000001FF" w:csb1="00000000"/>
+    <w:sig w:usb0="E4002EFF" w:usb1="C200247B" w:usb2="00000009" w:usb3="00000000" w:csb0="000001FF" w:csb1="00000000"/>
+  </w:font>
+  <w:font w:name="Aptos">
+    <w:charset w:val="00"/>
+    <w:family w:val="roman"/>
+    <w:pitch w:val="default"/>
+  </w:font>
+  <w:font w:name="Aptos Display">
+    <w:panose1 w:val="00000000000000000000"/>
+    <w:charset w:val="00"/>
+    <w:family w:val="roman"/>
+    <w:notTrueType/>
+    <w:pitch w:val="default"/>
   </w:font>
 </w:fonts>
 </file>
 
 <file path=word/glossary/settings.xml><?xml version="1.0" encoding="utf-8"?>
-<w:settings xmlns:mc="http://schemas.openxmlformats.org/markup-compatibility/2006" xmlns:o="urn:schemas-microsoft-com:office:office" xmlns:r="http://schemas.openxmlformats.org/officeDocument/2006/relationships" xmlns:m="http://schemas.openxmlformats.org/officeDocument/2006/math" xmlns:v="urn:schemas-microsoft-com:vml" xmlns:w10="urn:schemas-microsoft-com:office:word" xmlns:w="http://schemas.openxmlformats.org/wordprocessingml/2006/main" xmlns:w14="http://schemas.microsoft.com/office/word/2010/wordml" xmlns:w15="http://schemas.microsoft.com/office/word/2012/wordml" xmlns:w16cex="http://schemas.microsoft.com/office/word/2018/wordml/cex" xmlns:w16cid="http://schemas.microsoft.com/office/word/2016/wordml/cid" xmlns:w16="http://schemas.microsoft.com/office/word/2018/wordml" xmlns:w16se="http://schemas.microsoft.com/office/word/2015/wordml/symex" xmlns:sl="http://schemas.openxmlformats.org/schemaLibrary/2006/main" mc:Ignorable="w14 w15 w16se w16cid w16 w16cex">
+<w:settings xmlns:mc="http://schemas.openxmlformats.org/markup-compatibility/2006" xmlns:o="urn:schemas-microsoft-com:office:office" xmlns:r="http://schemas.openxmlformats.org/officeDocument/2006/relationships" xmlns:m="http://schemas.openxmlformats.org/officeDocument/2006/math" xmlns:v="urn:schemas-microsoft-com:vml" xmlns:w10="urn:schemas-microsoft-com:office:word" xmlns:w="http://schemas.openxmlformats.org/wordprocessingml/2006/main" xmlns:w14="http://schemas.microsoft.com/office/word/2010/wordml" xmlns:w15="http://schemas.microsoft.com/office/word/2012/wordml" xmlns:w16cex="http://schemas.microsoft.com/office/word/2018/wordml/cex" xmlns:w16cid="http://schemas.microsoft.com/office/word/2016/wordml/cid" xmlns:w16="http://schemas.microsoft.com/office/word/2018/wordml" xmlns:w16du="http://schemas.microsoft.com/office/word/2023/wordml/word16du" xmlns:w16sdtdh="http://schemas.microsoft.com/office/word/2020/wordml/sdtdatahash" xmlns:w16sdtfl="http://schemas.microsoft.com/office/word/2024/wordml/sdtformatlock" xmlns:w16se="http://schemas.microsoft.com/office/word/2015/wordml/symex" xmlns:sl="http://schemas.openxmlformats.org/schemaLibrary/2006/main" mc:Ignorable="w14 w15 w16se w16cid w16 w16cex w16sdtdh w16sdtfl w16du">
   <w:view w:val="normal"/>
   <w:defaultTabStop w:val="720"/>
   <w:characterSpacingControl w:val="doNotCompress"/>
@@ -3482,7 +3118,9 @@
     <w:rsid w:val="00197613"/>
     <w:rsid w:val="00315835"/>
     <w:rsid w:val="004861BE"/>
+    <w:rsid w:val="005E77DC"/>
     <w:rsid w:val="00BF03E8"/>
+    <w:rsid w:val="00CD235C"/>
     <w:rsid w:val="00D31265"/>
   </w:rsids>
   <m:mathPr>
@@ -3507,7 +3145,7 @@
 </file>
 
 <file path=word/glossary/styles.xml><?xml version="1.0" encoding="utf-8"?>
-<w:styles xmlns:mc="http://schemas.openxmlformats.org/markup-compatibility/2006" xmlns:r="http://schemas.openxmlformats.org/officeDocument/2006/relationships" xmlns:w="http://schemas.openxmlformats.org/wordprocessingml/2006/main" xmlns:w14="http://schemas.microsoft.com/office/word/2010/wordml" xmlns:w15="http://schemas.microsoft.com/office/word/2012/wordml" xmlns:w16cex="http://schemas.microsoft.com/office/word/2018/wordml/cex" xmlns:w16cid="http://schemas.microsoft.com/office/word/2016/wordml/cid" xmlns:w16="http://schemas.microsoft.com/office/word/2018/wordml" xmlns:w16se="http://schemas.microsoft.com/office/word/2015/wordml/symex" mc:Ignorable="w14 w15 w16se w16cid w16 w16cex">
+<w:styles xmlns:mc="http://schemas.openxmlformats.org/markup-compatibility/2006" xmlns:r="http://schemas.openxmlformats.org/officeDocument/2006/relationships" xmlns:w="http://schemas.openxmlformats.org/wordprocessingml/2006/main" xmlns:w14="http://schemas.microsoft.com/office/word/2010/wordml" xmlns:w15="http://schemas.microsoft.com/office/word/2012/wordml" xmlns:w16cex="http://schemas.microsoft.com/office/word/2018/wordml/cex" xmlns:w16cid="http://schemas.microsoft.com/office/word/2016/wordml/cid" xmlns:w16="http://schemas.microsoft.com/office/word/2018/wordml" xmlns:w16du="http://schemas.microsoft.com/office/word/2023/wordml/word16du" xmlns:w16sdtdh="http://schemas.microsoft.com/office/word/2020/wordml/sdtdatahash" xmlns:w16sdtfl="http://schemas.microsoft.com/office/word/2024/wordml/sdtformatlock" xmlns:w16se="http://schemas.microsoft.com/office/word/2015/wordml/symex" mc:Ignorable="w14 w15 w16se w16cid w16 w16cex w16sdtdh w16sdtfl w16du">
   <w:docDefaults>
     <w:rPrDefault>
       <w:rPr>
@@ -3950,7 +3588,7 @@
 </file>
 
 <file path=word/glossary/webSettings.xml><?xml version="1.0" encoding="utf-8"?>
-<w:webSettings xmlns:mc="http://schemas.openxmlformats.org/markup-compatibility/2006" xmlns:r="http://schemas.openxmlformats.org/officeDocument/2006/relationships" xmlns:w="http://schemas.openxmlformats.org/wordprocessingml/2006/main" xmlns:w14="http://schemas.microsoft.com/office/word/2010/wordml" xmlns:w15="http://schemas.microsoft.com/office/word/2012/wordml" xmlns:w16cex="http://schemas.microsoft.com/office/word/2018/wordml/cex" xmlns:w16cid="http://schemas.microsoft.com/office/word/2016/wordml/cid" xmlns:w16="http://schemas.microsoft.com/office/word/2018/wordml" xmlns:w16se="http://schemas.microsoft.com/office/word/2015/wordml/symex" mc:Ignorable="w14 w15 w16se w16cid w16 w16cex">
+<w:webSettings xmlns:mc="http://schemas.openxmlformats.org/markup-compatibility/2006" xmlns:r="http://schemas.openxmlformats.org/officeDocument/2006/relationships" xmlns:w="http://schemas.openxmlformats.org/wordprocessingml/2006/main" xmlns:w14="http://schemas.microsoft.com/office/word/2010/wordml" xmlns:w15="http://schemas.microsoft.com/office/word/2012/wordml" xmlns:w16cex="http://schemas.microsoft.com/office/word/2018/wordml/cex" xmlns:w16cid="http://schemas.microsoft.com/office/word/2016/wordml/cid" xmlns:w16="http://schemas.microsoft.com/office/word/2018/wordml" xmlns:w16du="http://schemas.microsoft.com/office/word/2023/wordml/word16du" xmlns:w16sdtdh="http://schemas.microsoft.com/office/word/2020/wordml/sdtdatahash" xmlns:w16sdtfl="http://schemas.microsoft.com/office/word/2024/wordml/sdtformatlock" xmlns:w16se="http://schemas.microsoft.com/office/word/2015/wordml/symex" mc:Ignorable="w14 w15 w16se w16cid w16 w16cex w16sdtdh w16sdtfl w16du">
   <w:optimizeForBrowser/>
   <w:allowPNG/>
 </w:webSettings>
@@ -4251,6 +3889,44 @@
 </a:theme>
 </file>
 
+<file path=word/webextensions/taskpanes.xml><?xml version="1.0" encoding="utf-8"?>
+<wetp:taskpanes xmlns:wetp="http://schemas.microsoft.com/office/webextensions/taskpanes/2010/11">
+  <wetp:taskpane dockstate="right" visibility="1" width="350" row="0">
+    <wetp:webextensionref xmlns:r="http://schemas.openxmlformats.org/officeDocument/2006/relationships" r:id="rId1"/>
+  </wetp:taskpane>
+  <wetp:taskpane dockstate="right" visibility="0" width="350" row="1">
+    <wetp:webextensionref xmlns:r="http://schemas.openxmlformats.org/officeDocument/2006/relationships" r:id="rId2"/>
+  </wetp:taskpane>
+</wetp:taskpanes>
+</file>
+
+<file path=word/webextensions/webextension1.xml><?xml version="1.0" encoding="utf-8"?>
+<we:webextension xmlns:we="http://schemas.microsoft.com/office/webextensions/webextension/2010/11" id="{0E69683B-A092-4946-9DA3-CB89B960B801}">
+  <we:reference id="wa104379629" version="1.3.0.0" store="en-US" storeType="OMEX"/>
+  <we:alternateReferences>
+    <we:reference id="WA104379629" version="1.3.0.0" store="" storeType="OMEX"/>
+  </we:alternateReferences>
+  <we:properties>
+    <we:property name="RuntimeConfig" value="{&quot;HostName&quot;:&quot;&quot;,&quot;Applets&quot;:{},&quot;ActiveAppletId&quot;:&quot;&quot;,&quot;Language&quot;:&quot;EN&quot;,&quot;DocumentId&quot;:&quot;a7334960-a3fd-4e9b-a3d9-3fa44cb68879&quot;,&quot;DateCreated&quot;:&quot;2026-06-16T15:30:23.838Z&quot;,&quot;GenerationActivityId&quot;:&quot;&quot;}"/>
+    <we:property name="Features" value="{&quot;LogDomEvents&quot;:false,&quot;LogTelemetry&quot;:true,&quot;ResourceHeadersRefresh&quot;:true}"/>
+  </we:properties>
+  <we:bindings/>
+  <we:snapshot xmlns:r="http://schemas.openxmlformats.org/officeDocument/2006/relationships"/>
+</we:webextension>
+</file>
+
+<file path=word/webextensions/webextension2.xml><?xml version="1.0" encoding="utf-8"?>
+<we:webextension xmlns:we="http://schemas.microsoft.com/office/webextensions/webextension/2010/11" id="{97A71789-02C1-4904-9C15-0CE2F46C6CAA}">
+  <we:reference id="wa200007356" version="2.0.0.1" store="en-US" storeType="OMEX"/>
+  <we:alternateReferences>
+    <we:reference id="wa200007356" version="2.0.0.1" store="wa200007356" storeType="OMEX"/>
+  </we:alternateReferences>
+  <we:properties/>
+  <we:bindings/>
+  <we:snapshot xmlns:r="http://schemas.openxmlformats.org/officeDocument/2006/relationships"/>
+</we:webextension>
+</file>
+
 <file path=customXml/item1.xml>��< ? x m l   v e r s i o n = " 1 . 0 "   e n c o d i n g = " u t f - 1 6 " ? >   
  < N a v W o r d R e p o r t X m l P a r t   x m l n s = " u r n : m i c r o s o f t - d y n a m i c s - n a v / r e p o r t s / F i n a n c e _ S h a r e _ C e r t i f i c a t e / 5 2 1 8 6 1 5 7 / " > 
</xml_diff>